<commit_message>
maj de la doc
</commit_message>
<xml_diff>
--- a/assistant dfci.docx
+++ b/assistant dfci.docx
@@ -167,7 +167,7 @@
                 <w:sz w:val="28"/>
                 <w:szCs w:val="28"/>
               </w:rPr>
-              <w:t>V0.</w:t>
+              <w:t>V</w:t>
             </w:r>
             <w:r>
               <w:rPr>
@@ -177,7 +177,7 @@
                 <w:sz w:val="28"/>
                 <w:szCs w:val="28"/>
               </w:rPr>
-              <w:t>1</w:t>
+              <w:t>1.0.0</w:t>
             </w:r>
           </w:p>
         </w:tc>
@@ -426,15 +426,7 @@
                     <w:b/>
                     <w:szCs w:val="18"/>
                   </w:rPr>
-                  <w:t>0.</w:t>
-                </w:r>
-                <w:r>
-                  <w:rPr>
-                    <w:rFonts w:cs="Arial"/>
-                    <w:b/>
-                    <w:szCs w:val="18"/>
-                  </w:rPr>
-                  <w:t>1</w:t>
+                  <w:t>1.0.0</w:t>
                 </w:r>
               </w:sdtContent>
             </w:sdt>
@@ -1108,6 +1100,7 @@
           </w:tcPr>
           <w:p>
             <w:pPr>
+              <w:ind w:firstLine="0"/>
               <w:jc w:val="center"/>
               <w:rPr>
                 <w:rFonts w:cs="Arial"/>
@@ -1119,7 +1112,35 @@
                 <w:rFonts w:cs="Arial"/>
                 <w:szCs w:val="18"/>
               </w:rPr>
-              <w:t>21/03/2024</w:t>
+              <w:t>10</w:t>
+            </w:r>
+            <w:r>
+              <w:rPr>
+                <w:rFonts w:cs="Arial"/>
+                <w:szCs w:val="18"/>
+              </w:rPr>
+              <w:t>/0</w:t>
+            </w:r>
+            <w:r>
+              <w:rPr>
+                <w:rFonts w:cs="Arial"/>
+                <w:szCs w:val="18"/>
+              </w:rPr>
+              <w:t>1</w:t>
+            </w:r>
+            <w:r>
+              <w:rPr>
+                <w:rFonts w:cs="Arial"/>
+                <w:szCs w:val="18"/>
+              </w:rPr>
+              <w:t>/202</w:t>
+            </w:r>
+            <w:r>
+              <w:rPr>
+                <w:rFonts w:cs="Arial"/>
+                <w:szCs w:val="18"/>
+              </w:rPr>
+              <w:t>5</w:t>
             </w:r>
           </w:p>
         </w:tc>
@@ -1157,6 +1178,7 @@
           <w:p>
             <w:pPr>
               <w:ind w:firstLine="0"/>
+              <w:jc w:val="left"/>
               <w:rPr>
                 <w:rFonts w:cs="Arial"/>
                 <w:szCs w:val="18"/>
@@ -1167,7 +1189,95 @@
                 <w:rFonts w:cs="Arial"/>
                 <w:szCs w:val="18"/>
               </w:rPr>
-              <w:t xml:space="preserve">Création </w:t>
+              <w:t>Création</w:t>
+            </w:r>
+          </w:p>
+        </w:tc>
+      </w:tr>
+      <w:tr>
+        <w:tc>
+          <w:tcPr>
+            <w:tcW w:w="1115" w:type="dxa"/>
+          </w:tcPr>
+          <w:p>
+            <w:pPr>
+              <w:ind w:firstLine="34"/>
+              <w:jc w:val="center"/>
+              <w:rPr>
+                <w:rFonts w:cs="Arial"/>
+                <w:szCs w:val="18"/>
+              </w:rPr>
+            </w:pPr>
+            <w:r>
+              <w:rPr>
+                <w:rFonts w:cs="Arial"/>
+                <w:szCs w:val="18"/>
+              </w:rPr>
+              <w:t>1.0.0</w:t>
+            </w:r>
+          </w:p>
+        </w:tc>
+        <w:tc>
+          <w:tcPr>
+            <w:tcW w:w="1514" w:type="dxa"/>
+          </w:tcPr>
+          <w:p>
+            <w:pPr>
+              <w:ind w:firstLine="0"/>
+              <w:jc w:val="center"/>
+              <w:rPr>
+                <w:rFonts w:cs="Arial"/>
+                <w:szCs w:val="18"/>
+              </w:rPr>
+            </w:pPr>
+            <w:r>
+              <w:rPr>
+                <w:rFonts w:cs="Arial"/>
+                <w:szCs w:val="18"/>
+              </w:rPr>
+              <w:t>08/07/2025</w:t>
+            </w:r>
+          </w:p>
+        </w:tc>
+        <w:tc>
+          <w:tcPr>
+            <w:tcW w:w="2472" w:type="dxa"/>
+          </w:tcPr>
+          <w:p>
+            <w:pPr>
+              <w:rPr>
+                <w:rFonts w:cs="Arial"/>
+                <w:szCs w:val="18"/>
+              </w:rPr>
+            </w:pPr>
+            <w:r>
+              <w:rPr>
+                <w:rFonts w:cs="Arial"/>
+                <w:szCs w:val="18"/>
+              </w:rPr>
+              <w:t>Gérôme PECHEUR</w:t>
+            </w:r>
+          </w:p>
+        </w:tc>
+        <w:tc>
+          <w:tcPr>
+            <w:tcW w:w="4771" w:type="dxa"/>
+          </w:tcPr>
+          <w:p>
+            <w:pPr>
+              <w:ind w:firstLine="0"/>
+              <w:jc w:val="left"/>
+              <w:rPr>
+                <w:rFonts w:cs="Arial"/>
+                <w:szCs w:val="18"/>
+              </w:rPr>
+            </w:pPr>
+            <w:r>
+              <w:rPr>
+                <w:rFonts w:cs="Arial"/>
+                <w:szCs w:val="18"/>
+              </w:rPr>
+              <w:t>Adaptation à le version 1.0.0 du plugin</w:t>
             </w:r>
           </w:p>
         </w:tc>
@@ -1246,7 +1356,7 @@
           <w:r>
             <w:fldChar w:fldCharType="separate"/>
           </w:r>
-          <w:hyperlink w:anchor="_Toc183424251" w:history="1">
+          <w:hyperlink w:anchor="_Toc202872345" w:history="1">
             <w:r>
               <w:rPr>
                 <w:rStyle w:val="Lienhypertexte"/>
@@ -1284,7 +1394,7 @@
               <w:rPr>
                 <w:webHidden/>
               </w:rPr>
-              <w:instrText xml:space="preserve"> PAGEREF _Toc183424251 \h </w:instrText>
+              <w:instrText xml:space="preserve"> PAGEREF _Toc202872345 \h </w:instrText>
             </w:r>
             <w:r>
               <w:rPr>
@@ -1321,7 +1431,7 @@
               <w:szCs w:val="22"/>
             </w:rPr>
           </w:pPr>
-          <w:hyperlink w:anchor="_Toc183424252" w:history="1">
+          <w:hyperlink w:anchor="_Toc202872346" w:history="1">
             <w:r>
               <w:rPr>
                 <w:rStyle w:val="Lienhypertexte"/>
@@ -1359,7 +1469,7 @@
               <w:rPr>
                 <w:webHidden/>
               </w:rPr>
-              <w:instrText xml:space="preserve"> PAGEREF _Toc183424252 \h </w:instrText>
+              <w:instrText xml:space="preserve"> PAGEREF _Toc202872346 \h </w:instrText>
             </w:r>
             <w:r>
               <w:rPr>
@@ -1396,7 +1506,7 @@
               <w:szCs w:val="22"/>
             </w:rPr>
           </w:pPr>
-          <w:hyperlink w:anchor="_Toc183424253" w:history="1">
+          <w:hyperlink w:anchor="_Toc202872347" w:history="1">
             <w:r>
               <w:rPr>
                 <w:rStyle w:val="Lienhypertexte"/>
@@ -1434,7 +1544,7 @@
               <w:rPr>
                 <w:webHidden/>
               </w:rPr>
-              <w:instrText xml:space="preserve"> PAGEREF _Toc183424253 \h </w:instrText>
+              <w:instrText xml:space="preserve"> PAGEREF _Toc202872347 \h </w:instrText>
             </w:r>
             <w:r>
               <w:rPr>
@@ -1471,7 +1581,7 @@
               <w:szCs w:val="22"/>
             </w:rPr>
           </w:pPr>
-          <w:hyperlink w:anchor="_Toc183424254" w:history="1">
+          <w:hyperlink w:anchor="_Toc202872348" w:history="1">
             <w:r>
               <w:rPr>
                 <w:rStyle w:val="Lienhypertexte"/>
@@ -1509,7 +1619,7 @@
               <w:rPr>
                 <w:webHidden/>
               </w:rPr>
-              <w:instrText xml:space="preserve"> PAGEREF _Toc183424254 \h </w:instrText>
+              <w:instrText xml:space="preserve"> PAGEREF _Toc202872348 \h </w:instrText>
             </w:r>
             <w:r>
               <w:rPr>
@@ -1546,7 +1656,7 @@
               <w:szCs w:val="22"/>
             </w:rPr>
           </w:pPr>
-          <w:hyperlink w:anchor="_Toc183424255" w:history="1">
+          <w:hyperlink w:anchor="_Toc202872349" w:history="1">
             <w:r>
               <w:rPr>
                 <w:rStyle w:val="Lienhypertexte"/>
@@ -1584,7 +1694,7 @@
               <w:rPr>
                 <w:webHidden/>
               </w:rPr>
-              <w:instrText xml:space="preserve"> PAGEREF _Toc183424255 \h </w:instrText>
+              <w:instrText xml:space="preserve"> PAGEREF _Toc202872349 \h </w:instrText>
             </w:r>
             <w:r>
               <w:rPr>
@@ -1620,7 +1730,7 @@
               <w:szCs w:val="22"/>
             </w:rPr>
           </w:pPr>
-          <w:hyperlink w:anchor="_Toc183424256" w:history="1">
+          <w:hyperlink w:anchor="_Toc202872350" w:history="1">
             <w:r>
               <w:rPr>
                 <w:rStyle w:val="Lienhypertexte"/>
@@ -1657,7 +1767,7 @@
               <w:rPr>
                 <w:webHidden/>
               </w:rPr>
-              <w:instrText xml:space="preserve"> PAGEREF _Toc183424256 \h </w:instrText>
+              <w:instrText xml:space="preserve"> PAGEREF _Toc202872350 \h </w:instrText>
             </w:r>
             <w:r>
               <w:rPr>
@@ -1693,7 +1803,7 @@
               <w:szCs w:val="22"/>
             </w:rPr>
           </w:pPr>
-          <w:hyperlink w:anchor="_Toc183424257" w:history="1">
+          <w:hyperlink w:anchor="_Toc202872351" w:history="1">
             <w:r>
               <w:rPr>
                 <w:rStyle w:val="Lienhypertexte"/>
@@ -1730,7 +1840,7 @@
               <w:rPr>
                 <w:webHidden/>
               </w:rPr>
-              <w:instrText xml:space="preserve"> PAGEREF _Toc183424257 \h </w:instrText>
+              <w:instrText xml:space="preserve"> PAGEREF _Toc202872351 \h </w:instrText>
             </w:r>
             <w:r>
               <w:rPr>
@@ -1767,7 +1877,7 @@
               <w:szCs w:val="22"/>
             </w:rPr>
           </w:pPr>
-          <w:hyperlink w:anchor="_Toc183424258" w:history="1">
+          <w:hyperlink w:anchor="_Toc202872352" w:history="1">
             <w:r>
               <w:rPr>
                 <w:rStyle w:val="Lienhypertexte"/>
@@ -1805,7 +1915,7 @@
               <w:rPr>
                 <w:webHidden/>
               </w:rPr>
-              <w:instrText xml:space="preserve"> PAGEREF _Toc183424258 \h </w:instrText>
+              <w:instrText xml:space="preserve"> PAGEREF _Toc202872352 \h </w:instrText>
             </w:r>
             <w:r>
               <w:rPr>
@@ -1822,7 +1932,7 @@
               <w:rPr>
                 <w:webHidden/>
               </w:rPr>
-              <w:t>6</w:t>
+              <w:t>5</w:t>
             </w:r>
             <w:r>
               <w:rPr>
@@ -1842,7 +1952,7 @@
               <w:szCs w:val="22"/>
             </w:rPr>
           </w:pPr>
-          <w:hyperlink w:anchor="_Toc183424259" w:history="1">
+          <w:hyperlink w:anchor="_Toc202872353" w:history="1">
             <w:r>
               <w:rPr>
                 <w:rStyle w:val="Lienhypertexte"/>
@@ -1880,7 +1990,7 @@
               <w:rPr>
                 <w:webHidden/>
               </w:rPr>
-              <w:instrText xml:space="preserve"> PAGEREF _Toc183424259 \h </w:instrText>
+              <w:instrText xml:space="preserve"> PAGEREF _Toc202872353 \h </w:instrText>
             </w:r>
             <w:r>
               <w:rPr>
@@ -1916,7 +2026,7 @@
               <w:szCs w:val="22"/>
             </w:rPr>
           </w:pPr>
-          <w:hyperlink w:anchor="_Toc183424260" w:history="1">
+          <w:hyperlink w:anchor="_Toc202872354" w:history="1">
             <w:r>
               <w:rPr>
                 <w:rStyle w:val="Lienhypertexte"/>
@@ -1953,7 +2063,7 @@
               <w:rPr>
                 <w:webHidden/>
               </w:rPr>
-              <w:instrText xml:space="preserve"> PAGEREF _Toc183424260 \h </w:instrText>
+              <w:instrText xml:space="preserve"> PAGEREF _Toc202872354 \h </w:instrText>
             </w:r>
             <w:r>
               <w:rPr>
@@ -1989,7 +2099,7 @@
               <w:szCs w:val="22"/>
             </w:rPr>
           </w:pPr>
-          <w:hyperlink w:anchor="_Toc183424261" w:history="1">
+          <w:hyperlink w:anchor="_Toc202872355" w:history="1">
             <w:r>
               <w:rPr>
                 <w:rStyle w:val="Lienhypertexte"/>
@@ -2026,7 +2136,7 @@
               <w:rPr>
                 <w:webHidden/>
               </w:rPr>
-              <w:instrText xml:space="preserve"> PAGEREF _Toc183424261 \h </w:instrText>
+              <w:instrText xml:space="preserve"> PAGEREF _Toc202872355 \h </w:instrText>
             </w:r>
             <w:r>
               <w:rPr>
@@ -2043,7 +2153,7 @@
               <w:rPr>
                 <w:webHidden/>
               </w:rPr>
-              <w:t>7</w:t>
+              <w:t>6</w:t>
             </w:r>
             <w:r>
               <w:rPr>
@@ -2096,7 +2206,7 @@
       <w:pPr>
         <w:pStyle w:val="Titre1"/>
       </w:pPr>
-      <w:bookmarkStart w:id="0" w:name="_Toc183424251"/>
+      <w:bookmarkStart w:id="0" w:name="_Toc202872345"/>
       <w:r>
         <w:t>Prérequis</w:t>
       </w:r>
@@ -2519,7 +2629,7 @@
       <w:pPr>
         <w:pStyle w:val="Titre1"/>
       </w:pPr>
-      <w:bookmarkStart w:id="5" w:name="_Toc183424252"/>
+      <w:bookmarkStart w:id="5" w:name="_Toc202872346"/>
       <w:r>
         <w:lastRenderedPageBreak/>
         <w:t>Résumé</w:t>
@@ -2532,7 +2642,13 @@
         <w:t xml:space="preserve">Ce plugin est une aide à la </w:t>
       </w:r>
       <w:r>
-        <w:t xml:space="preserve">modification des attributs des </w:t>
+        <w:t>modification des attributs</w:t>
+      </w:r>
+      <w:r>
+        <w:t xml:space="preserve"> sémantiques</w:t>
+      </w:r>
+      <w:r>
+        <w:t xml:space="preserve"> des </w:t>
       </w:r>
       <w:r>
         <w:t>complexes DFCI</w:t>
@@ -2547,7 +2663,7 @@
       <w:pPr>
         <w:pStyle w:val="Titre1"/>
       </w:pPr>
-      <w:bookmarkStart w:id="6" w:name="_Toc183424253"/>
+      <w:bookmarkStart w:id="6" w:name="_Toc202872347"/>
       <w:r>
         <w:t>Installation</w:t>
       </w:r>
@@ -2628,7 +2744,7 @@
       <w:pPr>
         <w:pStyle w:val="Titre1"/>
       </w:pPr>
-      <w:bookmarkStart w:id="7" w:name="_Toc183424254"/>
+      <w:bookmarkStart w:id="7" w:name="_Toc202872348"/>
       <w:r>
         <w:t>Présentation</w:t>
       </w:r>
@@ -2645,10 +2761,10 @@
           <w:noProof/>
         </w:rPr>
         <w:drawing>
-          <wp:inline distT="0" distB="0" distL="0" distR="0" wp14:anchorId="66847626" wp14:editId="0FC57A4F">
-            <wp:extent cx="6253480" cy="3013075"/>
-            <wp:effectExtent l="0" t="0" r="0" b="0"/>
-            <wp:docPr id="1" name="Image 1"/>
+          <wp:inline distT="0" distB="0" distL="0" distR="0" wp14:anchorId="785D6A55" wp14:editId="398F347F">
+            <wp:extent cx="3076575" cy="5195992"/>
+            <wp:effectExtent l="0" t="0" r="0" b="5080"/>
+            <wp:docPr id="17" name="Image 17"/>
             <wp:cNvGraphicFramePr>
               <a:graphicFrameLocks xmlns:a="http://schemas.openxmlformats.org/drawingml/2006/main" noChangeAspect="1"/>
             </wp:cNvGraphicFramePr>
@@ -2656,7 +2772,7 @@
               <a:graphicData uri="http://schemas.openxmlformats.org/drawingml/2006/picture">
                 <pic:pic xmlns:pic="http://schemas.openxmlformats.org/drawingml/2006/picture">
                   <pic:nvPicPr>
-                    <pic:cNvPr id="1" name="Image 1"/>
+                    <pic:cNvPr id="17" name="Image 17"/>
                     <pic:cNvPicPr/>
                   </pic:nvPicPr>
                   <pic:blipFill>
@@ -2674,7 +2790,7 @@
                   <pic:spPr>
                     <a:xfrm>
                       <a:off x="0" y="0"/>
-                      <a:ext cx="6253480" cy="3013075"/>
+                      <a:ext cx="3080272" cy="5202237"/>
                     </a:xfrm>
                     <a:prstGeom prst="rect">
                       <a:avLst/>
@@ -2696,7 +2812,13 @@
         <w:t xml:space="preserve">de </w:t>
       </w:r>
       <w:r>
-        <w:t>modifier certains attributs des tronçons de routes</w:t>
+        <w:t xml:space="preserve">modifier </w:t>
+      </w:r>
+      <w:r>
+        <w:t>les attributs des champs DFCI</w:t>
+      </w:r>
+      <w:r>
+        <w:t xml:space="preserve"> des tronçons de routes</w:t>
       </w:r>
     </w:p>
     <w:p/>
@@ -2708,14 +2830,6 @@
     <w:p>
       <w:r>
         <w:t>Le bouton « log » permet d’afficher le rapport des modifications</w:t>
-      </w:r>
-    </w:p>
-    <w:p>
-      <w:r>
-        <w:t xml:space="preserve">Le bouton « Réinitialiser les attributs de la sélection » permet </w:t>
-      </w:r>
-      <w:r>
-        <w:t>de re afficher les attributs de la sélection après modification dans l’interface mais avant la validation des modifications.</w:t>
       </w:r>
     </w:p>
     <w:p>
@@ -2836,88 +2950,17 @@
     <w:p/>
     <w:p>
       <w:r>
-        <w:t xml:space="preserve">Le bouton « Valider les modifications&gt; valide les modifications dans QGIS, le plugin « espace collaboratif » se charge d’impacter les bases </w:t>
-      </w:r>
-      <w:proofErr w:type="spellStart"/>
-      <w:r>
-        <w:t>BDTopo</w:t>
-      </w:r>
-      <w:proofErr w:type="spellEnd"/>
-      <w:r>
-        <w:t xml:space="preserve"> de </w:t>
-      </w:r>
-      <w:proofErr w:type="spellStart"/>
-      <w:r>
-        <w:t>l’ign</w:t>
-      </w:r>
-      <w:proofErr w:type="spellEnd"/>
-      <w:r>
-        <w:t>.</w:t>
-      </w:r>
-    </w:p>
-    <w:p>
-      <w:pPr>
-        <w:spacing w:before="0" w:after="200" w:line="276" w:lineRule="auto"/>
-        <w:jc w:val="left"/>
-      </w:pPr>
-      <w:r>
-        <w:br w:type="page"/>
-      </w:r>
-    </w:p>
-    <w:p/>
-    <w:p>
-      <w:pPr>
-        <w:pStyle w:val="Titre1"/>
-      </w:pPr>
-      <w:bookmarkStart w:id="8" w:name="_Toc183424255"/>
-      <w:r>
-        <w:t>Mode de sélection</w:t>
-      </w:r>
-      <w:bookmarkEnd w:id="8"/>
-    </w:p>
-    <w:p/>
-    <w:p>
-      <w:pPr>
-        <w:pStyle w:val="Titre2"/>
-      </w:pPr>
-      <w:bookmarkStart w:id="9" w:name="_Toc183424256"/>
-      <w:r>
-        <w:t>Sélection unique</w:t>
-      </w:r>
-      <w:bookmarkEnd w:id="9"/>
-    </w:p>
-    <w:p/>
-    <w:p>
-      <w:pPr>
-        <w:pStyle w:val="Paragraphedeliste"/>
-        <w:numPr>
-          <w:ilvl w:val="0"/>
-          <w:numId w:val="50"/>
-        </w:numPr>
-      </w:pPr>
-      <w:r>
-        <w:t>Sélection unique, on ne sélectionne qu’un seul tronçon avec l’outil de sélection de QGIS</w:t>
-      </w:r>
-    </w:p>
-    <w:p>
-      <w:pPr>
-        <w:pStyle w:val="Paragraphedeliste"/>
-        <w:ind w:left="936"/>
-      </w:pPr>
-    </w:p>
-    <w:p>
-      <w:pPr>
-        <w:ind w:left="576"/>
-      </w:pPr>
+        <w:t xml:space="preserve">Le bouton </w:t>
+      </w:r>
       <w:r>
         <w:rPr>
           <w:noProof/>
         </w:rPr>
         <w:drawing>
-          <wp:inline distT="0" distB="0" distL="0" distR="0" wp14:anchorId="1577150A" wp14:editId="3A373677">
-            <wp:extent cx="5572125" cy="2684782"/>
-            <wp:effectExtent l="0" t="0" r="0" b="1270"/>
-            <wp:docPr id="4" name="Image 4"/>
+          <wp:inline distT="0" distB="0" distL="0" distR="0" wp14:anchorId="4A777E39" wp14:editId="24902111">
+            <wp:extent cx="220999" cy="220999"/>
+            <wp:effectExtent l="0" t="0" r="7620" b="7620"/>
+            <wp:docPr id="18" name="Image 18"/>
             <wp:cNvGraphicFramePr>
               <a:graphicFrameLocks xmlns:a="http://schemas.openxmlformats.org/drawingml/2006/main" noChangeAspect="1"/>
             </wp:cNvGraphicFramePr>
@@ -2925,7 +2968,7 @@
               <a:graphicData uri="http://schemas.openxmlformats.org/drawingml/2006/picture">
                 <pic:pic xmlns:pic="http://schemas.openxmlformats.org/drawingml/2006/picture">
                   <pic:nvPicPr>
-                    <pic:cNvPr id="4" name="Image 4"/>
+                    <pic:cNvPr id="18" name="Image 18"/>
                     <pic:cNvPicPr/>
                   </pic:nvPicPr>
                   <pic:blipFill>
@@ -2943,7 +2986,7 @@
                   <pic:spPr>
                     <a:xfrm>
                       <a:off x="0" y="0"/>
-                      <a:ext cx="5579072" cy="2688129"/>
+                      <a:ext cx="220999" cy="220999"/>
                     </a:xfrm>
                     <a:prstGeom prst="rect">
                       <a:avLst/>
@@ -2955,30 +2998,98 @@
           </wp:inline>
         </w:drawing>
       </w:r>
+      <w:r>
+        <w:t>permet la sélection de toutes les entités comprises entre deux tronçons.</w:t>
+      </w:r>
+    </w:p>
+    <w:p/>
+    <w:p>
+      <w:r>
+        <w:t xml:space="preserve">Le bouton « Valider les modifications&gt; valide les modifications dans QGIS, le plugin « espace collaboratif » se charge d’impacter les bases </w:t>
+      </w:r>
+      <w:proofErr w:type="spellStart"/>
+      <w:r>
+        <w:t>BDTopo</w:t>
+      </w:r>
+      <w:proofErr w:type="spellEnd"/>
+      <w:r>
+        <w:t xml:space="preserve"> de </w:t>
+      </w:r>
+      <w:proofErr w:type="spellStart"/>
+      <w:r>
+        <w:t>l’ign</w:t>
+      </w:r>
+      <w:proofErr w:type="spellEnd"/>
+      <w:r>
+        <w:t>.</w:t>
+      </w:r>
     </w:p>
     <w:p>
       <w:pPr>
-        <w:ind w:left="576"/>
-      </w:pPr>
+        <w:spacing w:before="0" w:after="200" w:line="276" w:lineRule="auto"/>
+        <w:jc w:val="left"/>
+      </w:pPr>
+      <w:r>
+        <w:br w:type="page"/>
+      </w:r>
     </w:p>
     <w:p>
       <w:pPr>
-        <w:ind w:left="576"/>
-      </w:pPr>
-      <w:r>
-        <w:t>Tous les attributs du tronçon sélectionné s’affiche en vert dans l’interface.</w:t>
+        <w:pStyle w:val="Titre1"/>
+      </w:pPr>
+      <w:bookmarkStart w:id="8" w:name="_Toc202872349"/>
+      <w:r>
+        <w:lastRenderedPageBreak/>
+        <w:t>Mode de sélection</w:t>
+      </w:r>
+      <w:bookmarkEnd w:id="8"/>
+    </w:p>
+    <w:p/>
+    <w:p>
+      <w:pPr>
+        <w:pStyle w:val="Titre2"/>
+      </w:pPr>
+      <w:bookmarkStart w:id="9" w:name="_Toc202872350"/>
+      <w:r>
+        <w:t>Sélection unique</w:t>
+      </w:r>
+      <w:bookmarkEnd w:id="9"/>
+    </w:p>
+    <w:p/>
+    <w:p>
+      <w:pPr>
+        <w:ind w:firstLine="576"/>
+      </w:pPr>
+      <w:r>
+        <w:t>Les attributs affichés sont ceux du tronçon sélectionné</w:t>
+      </w:r>
+      <w:r>
+        <w:t> ;</w:t>
       </w:r>
     </w:p>
     <w:p>
       <w:pPr>
-        <w:ind w:left="576"/>
-      </w:pPr>
+        <w:ind w:firstLine="576"/>
+      </w:pPr>
+      <w:r>
+        <w:t>En vert lorsqu’ils sont différents de « NULL » ou de vide.</w:t>
+      </w:r>
     </w:p>
     <w:p>
       <w:pPr>
+        <w:ind w:left="576"/>
+      </w:pPr>
+    </w:p>
+    <w:p>
+      <w:pPr>
+        <w:ind w:left="576"/>
+      </w:pPr>
+    </w:p>
+    <w:p>
+      <w:pPr>
         <w:pStyle w:val="Titre2"/>
       </w:pPr>
-      <w:bookmarkStart w:id="10" w:name="_Toc183424257"/>
+      <w:bookmarkStart w:id="10" w:name="_Toc202872351"/>
       <w:r>
         <w:t>Sélection multiple</w:t>
       </w:r>
@@ -3037,10 +3148,10 @@
           <w:noProof/>
         </w:rPr>
         <w:drawing>
-          <wp:inline distT="0" distB="0" distL="0" distR="0" wp14:anchorId="3904A628" wp14:editId="02672540">
-            <wp:extent cx="742950" cy="144155"/>
-            <wp:effectExtent l="0" t="0" r="0" b="8255"/>
-            <wp:docPr id="11" name="Image 11"/>
+          <wp:inline distT="0" distB="0" distL="0" distR="0" wp14:anchorId="2F93602B" wp14:editId="2EBFD18C">
+            <wp:extent cx="220999" cy="220999"/>
+            <wp:effectExtent l="0" t="0" r="7620" b="7620"/>
+            <wp:docPr id="19" name="Image 19"/>
             <wp:cNvGraphicFramePr>
               <a:graphicFrameLocks xmlns:a="http://schemas.openxmlformats.org/drawingml/2006/main" noChangeAspect="1"/>
             </wp:cNvGraphicFramePr>
@@ -3048,7 +3159,156 @@
               <a:graphicData uri="http://schemas.openxmlformats.org/drawingml/2006/picture">
                 <pic:pic xmlns:pic="http://schemas.openxmlformats.org/drawingml/2006/picture">
                   <pic:nvPicPr>
-                    <pic:cNvPr id="11" name="Image 11"/>
+                    <pic:cNvPr id="19" name="Image 19"/>
+                    <pic:cNvPicPr/>
+                  </pic:nvPicPr>
+                  <pic:blipFill>
+                    <a:blip r:embed="rId21">
+                      <a:extLst>
+                        <a:ext uri="{28A0092B-C50C-407E-A947-70E740481C1C}">
+                          <a14:useLocalDpi xmlns:a14="http://schemas.microsoft.com/office/drawing/2010/main" val="0"/>
+                        </a:ext>
+                      </a:extLst>
+                    </a:blip>
+                    <a:stretch>
+                      <a:fillRect/>
+                    </a:stretch>
+                  </pic:blipFill>
+                  <pic:spPr>
+                    <a:xfrm>
+                      <a:off x="0" y="0"/>
+                      <a:ext cx="220999" cy="220999"/>
+                    </a:xfrm>
+                    <a:prstGeom prst="rect">
+                      <a:avLst/>
+                    </a:prstGeom>
+                  </pic:spPr>
+                </pic:pic>
+              </a:graphicData>
+            </a:graphic>
+          </wp:inline>
+        </w:drawing>
+      </w:r>
+      <w:r>
+        <w:t xml:space="preserve">, le résultat est une sélection de tous les tronçons entre le premier et le deuxième sélectionné respectant l’algorithme du chemin le plus court. Un contrôle visuel est toutefois nécessaire afin de vérifier si les tronçons sont bien ceux </w:t>
+      </w:r>
+      <w:r>
+        <w:t>désirés.</w:t>
+      </w:r>
+    </w:p>
+    <w:p>
+      <w:pPr>
+        <w:pStyle w:val="Paragraphedeliste"/>
+        <w:ind w:left="936"/>
+      </w:pPr>
+    </w:p>
+    <w:p>
+      <w:pPr>
+        <w:pStyle w:val="Paragraphedeliste"/>
+        <w:ind w:left="936"/>
+      </w:pPr>
+    </w:p>
+    <w:p>
+      <w:pPr>
+        <w:pStyle w:val="Paragraphedeliste"/>
+        <w:ind w:left="936"/>
+      </w:pPr>
+      <w:r>
+        <w:t>Seuls les attributs communs</w:t>
+      </w:r>
+      <w:r>
+        <w:t xml:space="preserve"> à tous les tronçons sont représentés en vert.</w:t>
+      </w:r>
+    </w:p>
+    <w:p/>
+    <w:p>
+      <w:pPr>
+        <w:pStyle w:val="Titre1"/>
+      </w:pPr>
+      <w:bookmarkStart w:id="11" w:name="_Toc223425641"/>
+      <w:bookmarkStart w:id="12" w:name="_Toc223756086"/>
+      <w:bookmarkStart w:id="13" w:name="_Toc223425646"/>
+      <w:bookmarkStart w:id="14" w:name="_Toc223756091"/>
+      <w:bookmarkStart w:id="15" w:name="_Toc223425647"/>
+      <w:bookmarkStart w:id="16" w:name="_Toc223756092"/>
+      <w:bookmarkStart w:id="17" w:name="_Toc215049623"/>
+      <w:bookmarkStart w:id="18" w:name="_Toc202872352"/>
+      <w:bookmarkEnd w:id="11"/>
+      <w:bookmarkEnd w:id="12"/>
+      <w:bookmarkEnd w:id="13"/>
+      <w:bookmarkEnd w:id="14"/>
+      <w:bookmarkEnd w:id="15"/>
+      <w:bookmarkEnd w:id="16"/>
+      <w:r>
+        <w:t>Modification</w:t>
+      </w:r>
+      <w:bookmarkEnd w:id="18"/>
+    </w:p>
+    <w:p>
+      <w:pPr>
+        <w:pStyle w:val="Paragraphedeliste"/>
+      </w:pPr>
+    </w:p>
+    <w:p>
+      <w:r>
+        <w:t xml:space="preserve">Une fois les tronçons sélectionnés il suffit de </w:t>
+      </w:r>
+      <w:r>
+        <w:t>choisir le ou les attributs à modifier</w:t>
+      </w:r>
+      <w:r>
+        <w:t>.</w:t>
+      </w:r>
+    </w:p>
+    <w:p/>
+    <w:p>
+      <w:r>
+        <w:rPr>
+          <w:noProof/>
+        </w:rPr>
+        <w:t xml:space="preserve"> </w:t>
+      </w:r>
+      <w:r>
+        <w:rPr>
+          <w:noProof/>
+        </w:rPr>
+        <w:tab/>
+      </w:r>
+      <w:r>
+        <w:rPr>
+          <w:noProof/>
+        </w:rPr>
+        <w:tab/>
+      </w:r>
+      <w:r>
+        <w:rPr>
+          <w:noProof/>
+        </w:rPr>
+        <w:tab/>
+      </w:r>
+      <w:r>
+        <w:rPr>
+          <w:noProof/>
+        </w:rPr>
+        <w:tab/>
+      </w:r>
+      <w:r>
+        <w:rPr>
+          <w:noProof/>
+        </w:rPr>
+        <w:drawing>
+          <wp:inline distT="0" distB="0" distL="0" distR="0" wp14:anchorId="5FA4637E" wp14:editId="44D5F4FE">
+            <wp:extent cx="2376000" cy="4010400"/>
+            <wp:effectExtent l="0" t="0" r="5715" b="0"/>
+            <wp:docPr id="20" name="Image 20"/>
+            <wp:cNvGraphicFramePr>
+              <a:graphicFrameLocks xmlns:a="http://schemas.openxmlformats.org/drawingml/2006/main" noChangeAspect="1"/>
+            </wp:cNvGraphicFramePr>
+            <a:graphic xmlns:a="http://schemas.openxmlformats.org/drawingml/2006/main">
+              <a:graphicData uri="http://schemas.openxmlformats.org/drawingml/2006/picture">
+                <pic:pic xmlns:pic="http://schemas.openxmlformats.org/drawingml/2006/picture">
+                  <pic:nvPicPr>
+                    <pic:cNvPr id="20" name="Image 20"/>
                     <pic:cNvPicPr/>
                   </pic:nvPicPr>
                   <pic:blipFill>
@@ -3066,7 +3326,7 @@
                   <pic:spPr>
                     <a:xfrm>
                       <a:off x="0" y="0"/>
-                      <a:ext cx="752161" cy="145942"/>
+                      <a:ext cx="2376000" cy="4010400"/>
                     </a:xfrm>
                     <a:prstGeom prst="rect">
                       <a:avLst/>
@@ -3078,236 +3338,17 @@
           </wp:inline>
         </w:drawing>
       </w:r>
-      <w:r>
-        <w:t>, le résultat est une sélection de tous les tronçons entre le premier et le deuxième sélectionné respectant l’algorithme du chemin le plus court. Un contrôle visuel est toutefois nécessaire afin de vérifier si les tronçons sont bien ceux désirés..</w:t>
-      </w:r>
-    </w:p>
-    <w:p>
-      <w:pPr>
-        <w:pStyle w:val="Paragraphedeliste"/>
-        <w:ind w:left="936"/>
-      </w:pPr>
-    </w:p>
-    <w:p>
-      <w:pPr>
-        <w:pStyle w:val="Paragraphedeliste"/>
-        <w:ind w:left="936"/>
-      </w:pPr>
-      <w:r>
-        <w:rPr>
-          <w:noProof/>
-        </w:rPr>
-        <w:drawing>
-          <wp:inline distT="0" distB="0" distL="0" distR="0" wp14:anchorId="5B405552" wp14:editId="7F6A9770">
-            <wp:extent cx="4495800" cy="2166183"/>
-            <wp:effectExtent l="0" t="0" r="0" b="5715"/>
-            <wp:docPr id="10" name="Image 10"/>
-            <wp:cNvGraphicFramePr>
-              <a:graphicFrameLocks xmlns:a="http://schemas.openxmlformats.org/drawingml/2006/main" noChangeAspect="1"/>
-            </wp:cNvGraphicFramePr>
-            <a:graphic xmlns:a="http://schemas.openxmlformats.org/drawingml/2006/main">
-              <a:graphicData uri="http://schemas.openxmlformats.org/drawingml/2006/picture">
-                <pic:pic xmlns:pic="http://schemas.openxmlformats.org/drawingml/2006/picture">
-                  <pic:nvPicPr>
-                    <pic:cNvPr id="10" name="Image 10"/>
-                    <pic:cNvPicPr/>
-                  </pic:nvPicPr>
-                  <pic:blipFill>
-                    <a:blip r:embed="rId23">
-                      <a:extLst>
-                        <a:ext uri="{28A0092B-C50C-407E-A947-70E740481C1C}">
-                          <a14:useLocalDpi xmlns:a14="http://schemas.microsoft.com/office/drawing/2010/main" val="0"/>
-                        </a:ext>
-                      </a:extLst>
-                    </a:blip>
-                    <a:stretch>
-                      <a:fillRect/>
-                    </a:stretch>
-                  </pic:blipFill>
-                  <pic:spPr>
-                    <a:xfrm>
-                      <a:off x="0" y="0"/>
-                      <a:ext cx="4525932" cy="2180701"/>
-                    </a:xfrm>
-                    <a:prstGeom prst="rect">
-                      <a:avLst/>
-                    </a:prstGeom>
-                  </pic:spPr>
-                </pic:pic>
-              </a:graphicData>
-            </a:graphic>
-          </wp:inline>
-        </w:drawing>
-      </w:r>
-    </w:p>
-    <w:p>
-      <w:pPr>
-        <w:pStyle w:val="Paragraphedeliste"/>
-        <w:ind w:left="936"/>
-      </w:pPr>
-      <w:r>
-        <w:t>Seuls les attributs communs</w:t>
-      </w:r>
-      <w:r>
-        <w:t xml:space="preserve"> à tous les tronçons sont représentés en vert.</w:t>
-      </w:r>
     </w:p>
     <w:p/>
     <w:p>
-      <w:pPr>
-        <w:pStyle w:val="Titre1"/>
-      </w:pPr>
-      <w:bookmarkStart w:id="11" w:name="_Toc223425641"/>
-      <w:bookmarkStart w:id="12" w:name="_Toc223756086"/>
-      <w:bookmarkStart w:id="13" w:name="_Toc223425646"/>
-      <w:bookmarkStart w:id="14" w:name="_Toc223756091"/>
-      <w:bookmarkStart w:id="15" w:name="_Toc223425647"/>
-      <w:bookmarkStart w:id="16" w:name="_Toc223756092"/>
-      <w:bookmarkStart w:id="17" w:name="_Toc183424258"/>
-      <w:bookmarkStart w:id="18" w:name="_Toc215049623"/>
-      <w:bookmarkEnd w:id="11"/>
-      <w:bookmarkEnd w:id="12"/>
-      <w:bookmarkEnd w:id="13"/>
-      <w:bookmarkEnd w:id="14"/>
-      <w:bookmarkEnd w:id="15"/>
-      <w:bookmarkEnd w:id="16"/>
-      <w:r>
-        <w:lastRenderedPageBreak/>
-        <w:t>Modification</w:t>
-      </w:r>
-      <w:bookmarkEnd w:id="17"/>
-    </w:p>
-    <w:p>
-      <w:pPr>
-        <w:pStyle w:val="Paragraphedeliste"/>
-      </w:pPr>
-    </w:p>
-    <w:p>
-      <w:r>
-        <w:t>Une fois les tronçons sélectionnés il suffit de cliquer sur les boutons correspondant aux attributs à modifier.</w:t>
+      <w:r>
+        <w:t>Les attributs en rose seront ceux qui seront modifiés</w:t>
+      </w:r>
+      <w:r>
+        <w:t xml:space="preserve"> pour tous les tronçons sélectionnés.</w:t>
       </w:r>
     </w:p>
     <w:p/>
-    <w:p>
-      <w:r>
-        <w:rPr>
-          <w:noProof/>
-        </w:rPr>
-        <w:drawing>
-          <wp:inline distT="0" distB="0" distL="0" distR="0" wp14:anchorId="0A1B821F" wp14:editId="541AF051">
-            <wp:extent cx="6253480" cy="3013075"/>
-            <wp:effectExtent l="0" t="0" r="0" b="0"/>
-            <wp:docPr id="12" name="Image 12"/>
-            <wp:cNvGraphicFramePr>
-              <a:graphicFrameLocks xmlns:a="http://schemas.openxmlformats.org/drawingml/2006/main" noChangeAspect="1"/>
-            </wp:cNvGraphicFramePr>
-            <a:graphic xmlns:a="http://schemas.openxmlformats.org/drawingml/2006/main">
-              <a:graphicData uri="http://schemas.openxmlformats.org/drawingml/2006/picture">
-                <pic:pic xmlns:pic="http://schemas.openxmlformats.org/drawingml/2006/picture">
-                  <pic:nvPicPr>
-                    <pic:cNvPr id="12" name="Image 12"/>
-                    <pic:cNvPicPr/>
-                  </pic:nvPicPr>
-                  <pic:blipFill>
-                    <a:blip r:embed="rId24">
-                      <a:extLst>
-                        <a:ext uri="{28A0092B-C50C-407E-A947-70E740481C1C}">
-                          <a14:useLocalDpi xmlns:a14="http://schemas.microsoft.com/office/drawing/2010/main" val="0"/>
-                        </a:ext>
-                      </a:extLst>
-                    </a:blip>
-                    <a:stretch>
-                      <a:fillRect/>
-                    </a:stretch>
-                  </pic:blipFill>
-                  <pic:spPr>
-                    <a:xfrm>
-                      <a:off x="0" y="0"/>
-                      <a:ext cx="6253480" cy="3013075"/>
-                    </a:xfrm>
-                    <a:prstGeom prst="rect">
-                      <a:avLst/>
-                    </a:prstGeom>
-                  </pic:spPr>
-                </pic:pic>
-              </a:graphicData>
-            </a:graphic>
-          </wp:inline>
-        </w:drawing>
-      </w:r>
-    </w:p>
-    <w:p>
-      <w:r>
-        <w:t>Si on désir modifier la nature, les autres attributs sont remplis par défaut en tenant compte des valeurs possible (contrôle sur la nature).</w:t>
-      </w:r>
-    </w:p>
-    <w:p>
-      <w:r>
-        <w:t>Les attributs en rose seront ceux qui seront modifiés.</w:t>
-      </w:r>
-    </w:p>
-    <w:p/>
-    <w:p>
-      <w:r>
-        <w:t xml:space="preserve">Des </w:t>
-      </w:r>
-      <w:r>
-        <w:t>contrôles</w:t>
-      </w:r>
-      <w:r>
-        <w:t xml:space="preserve"> </w:t>
-      </w:r>
-      <w:r>
-        <w:t>sémantiques</w:t>
-      </w:r>
-      <w:r>
-        <w:t xml:space="preserve"> ont </w:t>
-      </w:r>
-      <w:r>
-        <w:t>été</w:t>
-      </w:r>
-      <w:r>
-        <w:t xml:space="preserve"> </w:t>
-      </w:r>
-      <w:r>
-        <w:t>implémentés</w:t>
-      </w:r>
-      <w:r>
-        <w:t xml:space="preserve">, ces </w:t>
-      </w:r>
-      <w:r>
-        <w:t>contrôles</w:t>
-      </w:r>
-      <w:r>
-        <w:t xml:space="preserve"> se basent sur </w:t>
-      </w:r>
-      <w:r>
-        <w:t>le champ</w:t>
-      </w:r>
-      <w:r>
-        <w:t xml:space="preserve"> « nature »</w:t>
-      </w:r>
-    </w:p>
-    <w:p>
-      <w:r>
-        <w:t xml:space="preserve">Les attributs </w:t>
-      </w:r>
-      <w:r>
-        <w:t>impossibles en</w:t>
-      </w:r>
-      <w:r>
-        <w:t xml:space="preserve"> fonction de la nature </w:t>
-      </w:r>
-      <w:r>
-        <w:t>apparaissent</w:t>
-      </w:r>
-      <w:r>
-        <w:t xml:space="preserve"> en grisés</w:t>
-      </w:r>
-      <w:r>
-        <w:t xml:space="preserve"> et barrés.</w:t>
-      </w:r>
-    </w:p>
     <w:p/>
     <w:p>
       <w:r>
@@ -3331,7 +3372,7 @@
       <w:pPr>
         <w:pStyle w:val="Titre1"/>
       </w:pPr>
-      <w:bookmarkStart w:id="19" w:name="_Toc183424259"/>
+      <w:bookmarkStart w:id="19" w:name="_Toc202872353"/>
       <w:r>
         <w:t>Extra</w:t>
       </w:r>
@@ -3342,13 +3383,13 @@
       <w:pPr>
         <w:pStyle w:val="Titre2"/>
       </w:pPr>
-      <w:bookmarkStart w:id="20" w:name="_Toc183424260"/>
+      <w:bookmarkStart w:id="20" w:name="_Toc202872354"/>
       <w:r>
         <w:t>Log</w:t>
       </w:r>
       <w:bookmarkEnd w:id="20"/>
     </w:p>
-    <w:bookmarkEnd w:id="18"/>
+    <w:bookmarkEnd w:id="17"/>
     <w:p>
       <w:pPr>
         <w:spacing w:line="276" w:lineRule="auto"/>
@@ -3389,7 +3430,7 @@
                     <pic:cNvPicPr/>
                   </pic:nvPicPr>
                   <pic:blipFill>
-                    <a:blip r:embed="rId25">
+                    <a:blip r:embed="rId23">
                       <a:extLst>
                         <a:ext uri="{28A0092B-C50C-407E-A947-70E740481C1C}">
                           <a14:useLocalDpi xmlns:a14="http://schemas.microsoft.com/office/drawing/2010/main" val="0"/>
@@ -3449,7 +3490,7 @@
                     <pic:cNvPicPr/>
                   </pic:nvPicPr>
                   <pic:blipFill>
-                    <a:blip r:embed="rId26" cstate="print">
+                    <a:blip r:embed="rId24" cstate="print">
                       <a:extLst>
                         <a:ext uri="{28A0092B-C50C-407E-A947-70E740481C1C}">
                           <a14:useLocalDpi xmlns:a14="http://schemas.microsoft.com/office/drawing/2010/main" val="0"/>
@@ -3481,21 +3522,13 @@
         <w:spacing w:before="0" w:after="200" w:line="276" w:lineRule="auto"/>
         <w:jc w:val="left"/>
       </w:pPr>
-      <w:r>
-        <w:br w:type="page"/>
-      </w:r>
     </w:p>
     <w:p>
       <w:pPr>
-        <w:spacing w:line="276" w:lineRule="auto"/>
-      </w:pPr>
-    </w:p>
-    <w:p>
-      <w:pPr>
         <w:pStyle w:val="Titre2"/>
       </w:pPr>
       <w:bookmarkStart w:id="21" w:name="_Toc182399295"/>
-      <w:bookmarkStart w:id="22" w:name="_Toc183424261"/>
+      <w:bookmarkStart w:id="22" w:name="_Toc202872355"/>
       <w:r>
         <w:t>A propos de</w:t>
       </w:r>
@@ -3534,7 +3567,7 @@
                     <pic:cNvPicPr/>
                   </pic:nvPicPr>
                   <pic:blipFill>
-                    <a:blip r:embed="rId27">
+                    <a:blip r:embed="rId25">
                       <a:extLst>
                         <a:ext uri="{28A0092B-C50C-407E-A947-70E740481C1C}">
                           <a14:useLocalDpi xmlns:a14="http://schemas.microsoft.com/office/drawing/2010/main" val="0"/>
@@ -3573,10 +3606,10 @@
           <w:noProof/>
         </w:rPr>
         <w:drawing>
-          <wp:inline distT="0" distB="0" distL="0" distR="0" wp14:anchorId="1DACA0DF" wp14:editId="167D10E7">
-            <wp:extent cx="4211314" cy="3371850"/>
+          <wp:inline distT="0" distB="0" distL="0" distR="0" wp14:anchorId="753C13A9" wp14:editId="38077A32">
+            <wp:extent cx="4782217" cy="2419688"/>
             <wp:effectExtent l="0" t="0" r="0" b="0"/>
-            <wp:docPr id="14" name="Image 14"/>
+            <wp:docPr id="22" name="Image 22"/>
             <wp:cNvGraphicFramePr>
               <a:graphicFrameLocks xmlns:a="http://schemas.openxmlformats.org/drawingml/2006/main" noChangeAspect="1"/>
             </wp:cNvGraphicFramePr>
@@ -3584,11 +3617,11 @@
               <a:graphicData uri="http://schemas.openxmlformats.org/drawingml/2006/picture">
                 <pic:pic xmlns:pic="http://schemas.openxmlformats.org/drawingml/2006/picture">
                   <pic:nvPicPr>
-                    <pic:cNvPr id="14" name="Image 14"/>
+                    <pic:cNvPr id="22" name="Image 22"/>
                     <pic:cNvPicPr/>
                   </pic:nvPicPr>
                   <pic:blipFill>
-                    <a:blip r:embed="rId28">
+                    <a:blip r:embed="rId26">
                       <a:extLst>
                         <a:ext uri="{28A0092B-C50C-407E-A947-70E740481C1C}">
                           <a14:useLocalDpi xmlns:a14="http://schemas.microsoft.com/office/drawing/2010/main" val="0"/>
@@ -3602,7 +3635,7 @@
                   <pic:spPr>
                     <a:xfrm>
                       <a:off x="0" y="0"/>
-                      <a:ext cx="4217439" cy="3376754"/>
+                      <a:ext cx="4782217" cy="2419688"/>
                     </a:xfrm>
                     <a:prstGeom prst="rect">
                       <a:avLst/>
@@ -3622,7 +3655,13 @@
     </w:p>
     <w:p>
       <w:r>
-        <w:t>Cette boite permet de suivre l’évolution des différentes versions ainsi que d’afficher cette documentation.</w:t>
+        <w:t xml:space="preserve">Cette boite permet de suivre l’évolution des différentes versions ainsi que d’afficher </w:t>
+      </w:r>
+      <w:r>
+        <w:t>la</w:t>
+      </w:r>
+      <w:r>
+        <w:t xml:space="preserve"> documentation.</w:t>
       </w:r>
     </w:p>
     <w:p>
@@ -3631,8 +3670,8 @@
       </w:pPr>
     </w:p>
     <w:sectPr>
-      <w:footerReference w:type="default" r:id="rId29"/>
-      <w:footerReference w:type="first" r:id="rId30"/>
+      <w:footerReference w:type="default" r:id="rId27"/>
+      <w:footerReference w:type="first" r:id="rId28"/>
       <w:pgSz w:w="11906" w:h="16838" w:code="9"/>
       <w:pgMar w:top="851" w:right="924" w:bottom="1616" w:left="1134" w:header="709" w:footer="607" w:gutter="0"/>
       <w:cols w:space="708"/>
@@ -4151,7 +4190,7 @@
         <v:path o:extrusionok="f" gradientshapeok="t" o:connecttype="rect"/>
         <o:lock v:ext="edit" aspectratio="t"/>
       </v:shapetype>
-      <v:shape id="_x0000_i1037" type="#_x0000_t75" style="width:30.6pt;height:52.8pt" o:bullet="t">
+      <v:shape id="_x0000_i1066" type="#_x0000_t75" style="width:30.75pt;height:52.5pt" o:bullet="t">
         <v:imagedata r:id="rId1" o:title="puce"/>
       </v:shape>
     </w:pict>
@@ -9233,14 +9272,14 @@
     <w:charset w:val="00"/>
     <w:family w:val="roman"/>
     <w:pitch w:val="variable"/>
-    <w:sig w:usb0="E0002EFF" w:usb1="C000785B" w:usb2="00000009" w:usb3="00000000" w:csb0="000001FF" w:csb1="00000000"/>
+    <w:sig w:usb0="E0002AFF" w:usb1="C0007843" w:usb2="00000009" w:usb3="00000000" w:csb0="000001FF" w:csb1="00000000"/>
   </w:font>
   <w:font w:name="Arial">
     <w:panose1 w:val="020B0604020202020204"/>
     <w:charset w:val="00"/>
     <w:family w:val="swiss"/>
     <w:pitch w:val="variable"/>
-    <w:sig w:usb0="E0002EFF" w:usb1="C000785B" w:usb2="00000009" w:usb3="00000000" w:csb0="000001FF" w:csb1="00000000"/>
+    <w:sig w:usb0="E0002AFF" w:usb1="C0007843" w:usb2="00000009" w:usb3="00000000" w:csb0="000001FF" w:csb1="00000000"/>
   </w:font>
   <w:font w:name="Wingdings">
     <w:panose1 w:val="05000000000000000000"/>
@@ -9261,7 +9300,7 @@
     <w:charset w:val="00"/>
     <w:family w:val="swiss"/>
     <w:pitch w:val="variable"/>
-    <w:sig w:usb0="E4002EFF" w:usb1="C000247B" w:usb2="00000009" w:usb3="00000000" w:csb0="000001FF" w:csb1="00000000"/>
+    <w:sig w:usb0="E0002AFF" w:usb1="4000ACFF" w:usb2="00000001" w:usb3="00000000" w:csb0="000001FF" w:csb1="00000000"/>
   </w:font>
   <w:font w:name="Tahoma">
     <w:panose1 w:val="020B0604030504040204"/>
@@ -9289,7 +9328,7 @@
     <w:charset w:val="00"/>
     <w:family w:val="swiss"/>
     <w:pitch w:val="variable"/>
-    <w:sig w:usb0="E4002EFF" w:usb1="C000247B" w:usb2="00000009" w:usb3="00000000" w:csb0="000001FF" w:csb1="00000000"/>
+    <w:sig w:usb0="A00002EF" w:usb1="4000207B" w:usb2="00000000" w:usb3="00000000" w:csb0="0000009F" w:csb1="00000000"/>
   </w:font>
 </w:fonts>
 </file>
@@ -9327,6 +9366,7 @@
     <w:rsid w:val="008E3192"/>
     <w:rsid w:val="00A07F9B"/>
     <w:rsid w:val="00AA7EBC"/>
+    <w:rsid w:val="00B143EC"/>
     <w:rsid w:val="00B65088"/>
     <w:rsid w:val="00B82D9E"/>
     <w:rsid w:val="00C13EA8"/>
@@ -10109,6 +10149,10 @@
 </file>
 
 <file path=customXml/item1.xml><?xml version="1.0" encoding="utf-8"?>
+<b:Sources xmlns:b="http://schemas.openxmlformats.org/officeDocument/2006/bibliography" xmlns="http://schemas.openxmlformats.org/officeDocument/2006/bibliography" SelectedStyle="\APA.XSL" StyleName="APA"/>
+</file>
+
+<file path=customXml/item2.xml><?xml version="1.0" encoding="utf-8"?>
 <ct:contentTypeSchema xmlns:ct="http://schemas.microsoft.com/office/2006/metadata/contentType" xmlns:ma="http://schemas.microsoft.com/office/2006/metadata/properties/metaAttributes" ct:_="" ma:_="" ma:contentTypeName="Modèle Vierge et formulaire" ma:contentTypeID="0x01010B0081A137466272CF4BAC585A26022CFF140700EC48CC62CD0ABD4F9840E839EA1E2732" ma:contentTypeVersion="201" ma:contentTypeDescription="MV" ma:contentTypeScope="" ma:versionID="2bd623b5a594494cd4a3ae1614ea3844">
   <xsd:schema xmlns:xsd="http://www.w3.org/2001/XMLSchema" xmlns:xs="http://www.w3.org/2001/XMLSchema" xmlns:p="http://schemas.microsoft.com/office/2006/metadata/properties" xmlns:ns1="a1322699-2fbb-4cce-8aba-176c4fa97253" xmlns:ns2="http://schemas.microsoft.com/sharepoint/v3/fields" xmlns:ns3="http://schemas.microsoft.com/sharepoint/v3" xmlns:ns4="f0ff482e-aa3b-417e-9d65-5f4cb2656651" targetNamespace="http://schemas.microsoft.com/office/2006/metadata/properties" ma:root="true" ma:fieldsID="e73f26e8e3603672e51fd804f7ff859e" ns1:_="" ns2:_="" ns3:_="" ns4:_="">
     <xsd:import namespace="a1322699-2fbb-4cce-8aba-176c4fa97253"/>
@@ -10616,66 +10660,12 @@
 </ct:contentTypeSchema>
 </file>
 
-<file path=customXml/item2.xml><?xml version="1.0" encoding="utf-8"?>
-<b:Sources xmlns:b="http://schemas.openxmlformats.org/officeDocument/2006/bibliography" xmlns="http://schemas.openxmlformats.org/officeDocument/2006/bibliography" SelectedStyle="\APA.XSL" StyleName="APA"/>
-</file>
-
 <file path=customXml/item3.xml><?xml version="1.0" encoding="utf-8"?>
 <?mso-contentType ?>
-<spe:Receivers xmlns:spe="http://schemas.microsoft.com/sharepoint/events">
-  <Receiver>
-    <Name>Document ID Generator</Name>
-    <Synchronization>Synchronous</Synchronization>
-    <Type>10001</Type>
-    <SequenceNumber>1000</SequenceNumber>
-    <Assembly>Microsoft.Office.DocumentManagement, Version=14.0.0.0, Culture=neutral, PublicKeyToken=71e9bce111e9429c</Assembly>
-    <Class>Microsoft.Office.DocumentManagement.Internal.DocIdHandler</Class>
-    <Data/>
-    <Filter/>
-  </Receiver>
-  <Receiver>
-    <Name>Document ID Generator</Name>
-    <Synchronization>Synchronous</Synchronization>
-    <Type>10002</Type>
-    <SequenceNumber>1001</SequenceNumber>
-    <Assembly>Microsoft.Office.DocumentManagement, Version=14.0.0.0, Culture=neutral, PublicKeyToken=71e9bce111e9429c</Assembly>
-    <Class>Microsoft.Office.DocumentManagement.Internal.DocIdHandler</Class>
-    <Data/>
-    <Filter/>
-  </Receiver>
-  <Receiver>
-    <Name>Document ID Generator</Name>
-    <Synchronization>Synchronous</Synchronization>
-    <Type>10004</Type>
-    <SequenceNumber>1002</SequenceNumber>
-    <Assembly>Microsoft.Office.DocumentManagement, Version=14.0.0.0, Culture=neutral, PublicKeyToken=71e9bce111e9429c</Assembly>
-    <Class>Microsoft.Office.DocumentManagement.Internal.DocIdHandler</Class>
-    <Data/>
-    <Filter/>
-  </Receiver>
-  <Receiver>
-    <Name>Document ID Generator</Name>
-    <Synchronization>Synchronous</Synchronization>
-    <Type>10006</Type>
-    <SequenceNumber>1003</SequenceNumber>
-    <Assembly>Microsoft.Office.DocumentManagement, Version=14.0.0.0, Culture=neutral, PublicKeyToken=71e9bce111e9429c</Assembly>
-    <Class>Microsoft.Office.DocumentManagement.Internal.DocIdHandler</Class>
-    <Data/>
-    <Filter/>
-  </Receiver>
-</spe:Receivers>
+<SharedContentType xmlns="Microsoft.SharePoint.Taxonomy.ContentTypeSync" SourceId="11ad8b72-dc11-4d56-b05b-950e088cc514" ContentTypeId="0x01010B0081A137466272CF4BAC585A26022CFF1407" PreviousValue="false"/>
 </file>
 
 <file path=customXml/item4.xml><?xml version="1.0" encoding="utf-8"?>
-<?mso-contentType ?>
-<FormTemplates xmlns="http://schemas.microsoft.com/sharepoint/v3/contenttype/forms">
-  <Display>DocumentLibraryForm</Display>
-  <Edit>DocumentLibraryForm</Edit>
-  <New>DocumentLibraryForm</New>
-</FormTemplates>
-</file>
-
-<file path=customXml/item5.xml><?xml version="1.0" encoding="utf-8"?>
 <p:properties xmlns:p="http://schemas.microsoft.com/office/2006/metadata/properties" xmlns:xsi="http://www.w3.org/2001/XMLSchema-instance" xmlns:pc="http://schemas.microsoft.com/office/infopath/2007/PartnerControls">
   <documentManagement>
     <redacteur xmlns="a1322699-2fbb-4cce-8aba-176c4fa97253">
@@ -10687,7 +10677,7 @@
     </redacteur>
     <Language xmlns="http://schemas.microsoft.com/sharepoint/v3">Français (France)</Language>
     <_Source xmlns="http://schemas.microsoft.com/sharepoint/v3/fields" xsi:nil="true"/>
-    <Version_IGN xmlns="a1322699-2fbb-4cce-8aba-176c4fa97253">0.1</Version_IGN>
+    <Version_IGN xmlns="a1322699-2fbb-4cce-8aba-176c4fa97253">1.0.0</Version_IGN>
     <p17c2b7c625547a3b70510fd871aaba1 xmlns="a1322699-2fbb-4cce-8aba-176c4fa97253">
       <Terms xmlns="http://schemas.microsoft.com/office/infopath/2007/PartnerControls">
         <TermInfo xmlns="http://schemas.microsoft.com/office/infopath/2007/PartnerControls">
@@ -10769,12 +10759,70 @@
 </p:properties>
 </file>
 
+<file path=customXml/item5.xml><?xml version="1.0" encoding="utf-8"?>
+<?mso-contentType ?>
+<FormTemplates xmlns="http://schemas.microsoft.com/sharepoint/v3/contenttype/forms">
+  <Display>DocumentLibraryForm</Display>
+  <Edit>DocumentLibraryForm</Edit>
+  <New>DocumentLibraryForm</New>
+</FormTemplates>
+</file>
+
 <file path=customXml/item6.xml><?xml version="1.0" encoding="utf-8"?>
 <?mso-contentType ?>
-<SharedContentType xmlns="Microsoft.SharePoint.Taxonomy.ContentTypeSync" SourceId="11ad8b72-dc11-4d56-b05b-950e088cc514" ContentTypeId="0x01010B0081A137466272CF4BAC585A26022CFF1407" PreviousValue="false"/>
+<spe:Receivers xmlns:spe="http://schemas.microsoft.com/sharepoint/events">
+  <Receiver>
+    <Name>Document ID Generator</Name>
+    <Synchronization>Synchronous</Synchronization>
+    <Type>10001</Type>
+    <SequenceNumber>1000</SequenceNumber>
+    <Assembly>Microsoft.Office.DocumentManagement, Version=14.0.0.0, Culture=neutral, PublicKeyToken=71e9bce111e9429c</Assembly>
+    <Class>Microsoft.Office.DocumentManagement.Internal.DocIdHandler</Class>
+    <Data/>
+    <Filter/>
+  </Receiver>
+  <Receiver>
+    <Name>Document ID Generator</Name>
+    <Synchronization>Synchronous</Synchronization>
+    <Type>10002</Type>
+    <SequenceNumber>1001</SequenceNumber>
+    <Assembly>Microsoft.Office.DocumentManagement, Version=14.0.0.0, Culture=neutral, PublicKeyToken=71e9bce111e9429c</Assembly>
+    <Class>Microsoft.Office.DocumentManagement.Internal.DocIdHandler</Class>
+    <Data/>
+    <Filter/>
+  </Receiver>
+  <Receiver>
+    <Name>Document ID Generator</Name>
+    <Synchronization>Synchronous</Synchronization>
+    <Type>10004</Type>
+    <SequenceNumber>1002</SequenceNumber>
+    <Assembly>Microsoft.Office.DocumentManagement, Version=14.0.0.0, Culture=neutral, PublicKeyToken=71e9bce111e9429c</Assembly>
+    <Class>Microsoft.Office.DocumentManagement.Internal.DocIdHandler</Class>
+    <Data/>
+    <Filter/>
+  </Receiver>
+  <Receiver>
+    <Name>Document ID Generator</Name>
+    <Synchronization>Synchronous</Synchronization>
+    <Type>10006</Type>
+    <SequenceNumber>1003</SequenceNumber>
+    <Assembly>Microsoft.Office.DocumentManagement, Version=14.0.0.0, Culture=neutral, PublicKeyToken=71e9bce111e9429c</Assembly>
+    <Class>Microsoft.Office.DocumentManagement.Internal.DocIdHandler</Class>
+    <Data/>
+    <Filter/>
+  </Receiver>
+</spe:Receivers>
 </file>
 
 <file path=customXml/itemProps1.xml><?xml version="1.0" encoding="utf-8"?>
+<ds:datastoreItem xmlns:ds="http://schemas.openxmlformats.org/officeDocument/2006/customXml" ds:itemID="{0FF0F878-5F0F-460C-9013-40E72731A637}">
+  <ds:schemaRefs>
+    <ds:schemaRef ds:uri="http://schemas.openxmlformats.org/officeDocument/2006/bibliography"/>
+  </ds:schemaRefs>
+</ds:datastoreItem>
+</file>
+
+<file path=customXml/itemProps2.xml><?xml version="1.0" encoding="utf-8"?>
 <ds:datastoreItem xmlns:ds="http://schemas.openxmlformats.org/officeDocument/2006/customXml" ds:itemID="{8BB746A0-EF99-488C-AF7A-E10AF123421B}">
   <ds:schemaRefs>
     <ds:schemaRef ds:uri="http://schemas.microsoft.com/office/2006/metadata/contentType"/>
@@ -10795,31 +10843,15 @@
 </ds:datastoreItem>
 </file>
 
-<file path=customXml/itemProps2.xml><?xml version="1.0" encoding="utf-8"?>
-<ds:datastoreItem xmlns:ds="http://schemas.openxmlformats.org/officeDocument/2006/customXml" ds:itemID="{0FF0F878-5F0F-460C-9013-40E72731A637}">
+<file path=customXml/itemProps3.xml><?xml version="1.0" encoding="utf-8"?>
+<ds:datastoreItem xmlns:ds="http://schemas.openxmlformats.org/officeDocument/2006/customXml" ds:itemID="{FBF226EE-3CF7-472C-91DD-A47C59CACF63}">
   <ds:schemaRefs>
-    <ds:schemaRef ds:uri="http://schemas.openxmlformats.org/officeDocument/2006/bibliography"/>
-  </ds:schemaRefs>
-</ds:datastoreItem>
-</file>
-
-<file path=customXml/itemProps3.xml><?xml version="1.0" encoding="utf-8"?>
-<ds:datastoreItem xmlns:ds="http://schemas.openxmlformats.org/officeDocument/2006/customXml" ds:itemID="{68AAD2DA-5792-4B35-80F3-9D0C21EB95BE}">
-  <ds:schemaRefs>
-    <ds:schemaRef ds:uri="http://schemas.microsoft.com/sharepoint/events"/>
+    <ds:schemaRef ds:uri="Microsoft.SharePoint.Taxonomy.ContentTypeSync"/>
   </ds:schemaRefs>
 </ds:datastoreItem>
 </file>
 
 <file path=customXml/itemProps4.xml><?xml version="1.0" encoding="utf-8"?>
-<ds:datastoreItem xmlns:ds="http://schemas.openxmlformats.org/officeDocument/2006/customXml" ds:itemID="{EEE2973D-7DD7-4773-855D-5CAD81242BDE}">
-  <ds:schemaRefs>
-    <ds:schemaRef ds:uri="http://schemas.microsoft.com/sharepoint/v3/contenttype/forms"/>
-  </ds:schemaRefs>
-</ds:datastoreItem>
-</file>
-
-<file path=customXml/itemProps5.xml><?xml version="1.0" encoding="utf-8"?>
 <ds:datastoreItem xmlns:ds="http://schemas.openxmlformats.org/officeDocument/2006/customXml" ds:itemID="{1159403A-C237-488E-8C5E-DABF9FCE7043}">
   <ds:schemaRefs>
     <ds:schemaRef ds:uri="http://schemas.microsoft.com/office/2006/metadata/properties"/>
@@ -10832,10 +10864,18 @@
 </ds:datastoreItem>
 </file>
 
+<file path=customXml/itemProps5.xml><?xml version="1.0" encoding="utf-8"?>
+<ds:datastoreItem xmlns:ds="http://schemas.openxmlformats.org/officeDocument/2006/customXml" ds:itemID="{EEE2973D-7DD7-4773-855D-5CAD81242BDE}">
+  <ds:schemaRefs>
+    <ds:schemaRef ds:uri="http://schemas.microsoft.com/sharepoint/v3/contenttype/forms"/>
+  </ds:schemaRefs>
+</ds:datastoreItem>
+</file>
+
 <file path=customXml/itemProps6.xml><?xml version="1.0" encoding="utf-8"?>
-<ds:datastoreItem xmlns:ds="http://schemas.openxmlformats.org/officeDocument/2006/customXml" ds:itemID="{FBF226EE-3CF7-472C-91DD-A47C59CACF63}">
+<ds:datastoreItem xmlns:ds="http://schemas.openxmlformats.org/officeDocument/2006/customXml" ds:itemID="{68AAD2DA-5792-4B35-80F3-9D0C21EB95BE}">
   <ds:schemaRefs>
-    <ds:schemaRef ds:uri="Microsoft.SharePoint.Taxonomy.ContentTypeSync"/>
+    <ds:schemaRef ds:uri="http://schemas.microsoft.com/sharepoint/events"/>
   </ds:schemaRefs>
 </ds:datastoreItem>
 </file>
</xml_diff>

<commit_message>
Modification de la documentation pour la version 1.1.0
</commit_message>
<xml_diff>
--- a/assistant dfci.docx
+++ b/assistant dfci.docx
@@ -177,7 +177,27 @@
                 <w:sz w:val="28"/>
                 <w:szCs w:val="28"/>
               </w:rPr>
-              <w:t>1.0.0</w:t>
+              <w:t>1.</w:t>
+            </w:r>
+            <w:r>
+              <w:rPr>
+                <w:rFonts w:ascii="Times New Roman" w:hAnsi="Times New Roman" w:cs="Times New Roman"/>
+                <w:b/>
+                <w:noProof/>
+                <w:sz w:val="28"/>
+                <w:szCs w:val="28"/>
+              </w:rPr>
+              <w:t>1</w:t>
+            </w:r>
+            <w:r>
+              <w:rPr>
+                <w:rFonts w:ascii="Times New Roman" w:hAnsi="Times New Roman" w:cs="Times New Roman"/>
+                <w:b/>
+                <w:noProof/>
+                <w:sz w:val="28"/>
+                <w:szCs w:val="28"/>
+              </w:rPr>
+              <w:t>.0</w:t>
             </w:r>
           </w:p>
         </w:tc>
@@ -426,7 +446,23 @@
                     <w:b/>
                     <w:szCs w:val="18"/>
                   </w:rPr>
-                  <w:t>1.0.0</w:t>
+                  <w:t>1.</w:t>
+                </w:r>
+                <w:r>
+                  <w:rPr>
+                    <w:rFonts w:cs="Arial"/>
+                    <w:b/>
+                    <w:szCs w:val="18"/>
+                  </w:rPr>
+                  <w:t>1</w:t>
+                </w:r>
+                <w:r>
+                  <w:rPr>
+                    <w:rFonts w:cs="Arial"/>
+                    <w:b/>
+                    <w:szCs w:val="18"/>
+                  </w:rPr>
+                  <w:t>.0</w:t>
                 </w:r>
               </w:sdtContent>
             </w:sdt>
@@ -445,7 +481,7 @@
               <w:docPart w:val="C16F81A3EFFC41CF93FB4F105A9B07C8"/>
             </w:placeholder>
             <w:dataBinding w:prefixMappings="xmlns:ns0='http://schemas.microsoft.com/office/2006/metadata/properties' xmlns:ns1='http://www.w3.org/2001/XMLSchema-instance' xmlns:ns2='http://schemas.microsoft.com/office/infopath/2007/PartnerControls' xmlns:ns3='a1322699-2fbb-4cce-8aba-176c4fa97253' xmlns:ns4='http://schemas.microsoft.com/sharepoint/v3' xmlns:ns5='http://schemas.microsoft.com/sharepoint/v3/fields' xmlns:ns6='f0ff482e-aa3b-417e-9d65-5f4cb2656651' " w:xpath="/ns0:properties[1]/documentManagement[1]/ns5:_DCDateCreated[1]" w:storeItemID="{1159403A-C237-488E-8C5E-DABF9FCE7043}"/>
-            <w:date w:fullDate="2025-07-24T00:00:00Z">
+            <w:date w:fullDate="2026-01-23T00:00:00Z">
               <w:dateFormat w:val="dd/MM/yyyy"/>
               <w:lid w:val="fr-FR"/>
               <w:storeMappedDataAs w:val="dateTime"/>
@@ -475,7 +511,7 @@
                     <w:rFonts w:cs="Arial"/>
                     <w:szCs w:val="18"/>
                   </w:rPr>
-                  <w:t>24/07/2025</w:t>
+                  <w:t>23/01/2026</w:t>
                 </w:r>
               </w:p>
             </w:tc>
@@ -1278,6 +1314,108 @@
                 <w:szCs w:val="18"/>
               </w:rPr>
               <w:t>Adaptation à le version 1.0.0 du plugin</w:t>
+            </w:r>
+          </w:p>
+        </w:tc>
+      </w:tr>
+      <w:tr>
+        <w:tc>
+          <w:tcPr>
+            <w:tcW w:w="1115" w:type="dxa"/>
+          </w:tcPr>
+          <w:p>
+            <w:pPr>
+              <w:ind w:firstLine="34"/>
+              <w:jc w:val="center"/>
+              <w:rPr>
+                <w:rFonts w:cs="Arial"/>
+                <w:szCs w:val="18"/>
+              </w:rPr>
+            </w:pPr>
+            <w:r>
+              <w:rPr>
+                <w:rFonts w:cs="Arial"/>
+                <w:szCs w:val="18"/>
+              </w:rPr>
+              <w:t>1.1.0</w:t>
+            </w:r>
+          </w:p>
+        </w:tc>
+        <w:tc>
+          <w:tcPr>
+            <w:tcW w:w="1514" w:type="dxa"/>
+          </w:tcPr>
+          <w:p>
+            <w:pPr>
+              <w:ind w:firstLine="0"/>
+              <w:jc w:val="center"/>
+              <w:rPr>
+                <w:rFonts w:cs="Arial"/>
+                <w:szCs w:val="18"/>
+              </w:rPr>
+            </w:pPr>
+            <w:r>
+              <w:rPr>
+                <w:rFonts w:cs="Arial"/>
+                <w:szCs w:val="18"/>
+              </w:rPr>
+              <w:t>23/01/2026</w:t>
+            </w:r>
+          </w:p>
+        </w:tc>
+        <w:tc>
+          <w:tcPr>
+            <w:tcW w:w="2472" w:type="dxa"/>
+          </w:tcPr>
+          <w:p>
+            <w:pPr>
+              <w:rPr>
+                <w:rFonts w:cs="Arial"/>
+                <w:szCs w:val="18"/>
+              </w:rPr>
+            </w:pPr>
+            <w:r>
+              <w:rPr>
+                <w:rFonts w:cs="Arial"/>
+                <w:szCs w:val="18"/>
+              </w:rPr>
+              <w:t>Philippe GALLEN</w:t>
+            </w:r>
+          </w:p>
+        </w:tc>
+        <w:tc>
+          <w:tcPr>
+            <w:tcW w:w="4771" w:type="dxa"/>
+          </w:tcPr>
+          <w:p>
+            <w:pPr>
+              <w:ind w:firstLine="0"/>
+              <w:jc w:val="left"/>
+              <w:rPr>
+                <w:rFonts w:cs="Arial"/>
+                <w:szCs w:val="18"/>
+              </w:rPr>
+            </w:pPr>
+            <w:r>
+              <w:rPr>
+                <w:rFonts w:cs="Arial"/>
+                <w:szCs w:val="18"/>
+              </w:rPr>
+              <w:t>Adaptation à le version 1.</w:t>
+            </w:r>
+            <w:r>
+              <w:rPr>
+                <w:rFonts w:cs="Arial"/>
+                <w:szCs w:val="18"/>
+              </w:rPr>
+              <w:t>1</w:t>
+            </w:r>
+            <w:r>
+              <w:rPr>
+                <w:rFonts w:cs="Arial"/>
+                <w:szCs w:val="18"/>
+              </w:rPr>
+              <w:t>.0 du plugin</w:t>
             </w:r>
           </w:p>
         </w:tc>
@@ -1356,7 +1494,7 @@
           <w:r>
             <w:fldChar w:fldCharType="separate"/>
           </w:r>
-          <w:hyperlink w:anchor="_Toc204249643" w:history="1">
+          <w:hyperlink w:anchor="_Toc220081230" w:history="1">
             <w:r>
               <w:rPr>
                 <w:rStyle w:val="Lienhypertexte"/>
@@ -1394,7 +1532,7 @@
               <w:rPr>
                 <w:webHidden/>
               </w:rPr>
-              <w:instrText xml:space="preserve"> PAGEREF _Toc204249643 \h </w:instrText>
+              <w:instrText xml:space="preserve"> PAGEREF _Toc220081230 \h </w:instrText>
             </w:r>
             <w:r>
               <w:rPr>
@@ -1431,7 +1569,7 @@
               <w:szCs w:val="22"/>
             </w:rPr>
           </w:pPr>
-          <w:hyperlink w:anchor="_Toc204249644" w:history="1">
+          <w:hyperlink w:anchor="_Toc220081231" w:history="1">
             <w:r>
               <w:rPr>
                 <w:rStyle w:val="Lienhypertexte"/>
@@ -1469,7 +1607,7 @@
               <w:rPr>
                 <w:webHidden/>
               </w:rPr>
-              <w:instrText xml:space="preserve"> PAGEREF _Toc204249644 \h </w:instrText>
+              <w:instrText xml:space="preserve"> PAGEREF _Toc220081231 \h </w:instrText>
             </w:r>
             <w:r>
               <w:rPr>
@@ -1506,7 +1644,7 @@
               <w:szCs w:val="22"/>
             </w:rPr>
           </w:pPr>
-          <w:hyperlink w:anchor="_Toc204249645" w:history="1">
+          <w:hyperlink w:anchor="_Toc220081232" w:history="1">
             <w:r>
               <w:rPr>
                 <w:rStyle w:val="Lienhypertexte"/>
@@ -1544,7 +1682,7 @@
               <w:rPr>
                 <w:webHidden/>
               </w:rPr>
-              <w:instrText xml:space="preserve"> PAGEREF _Toc204249645 \h </w:instrText>
+              <w:instrText xml:space="preserve"> PAGEREF _Toc220081232 \h </w:instrText>
             </w:r>
             <w:r>
               <w:rPr>
@@ -1581,7 +1719,7 @@
               <w:szCs w:val="22"/>
             </w:rPr>
           </w:pPr>
-          <w:hyperlink w:anchor="_Toc204249646" w:history="1">
+          <w:hyperlink w:anchor="_Toc220081233" w:history="1">
             <w:r>
               <w:rPr>
                 <w:rStyle w:val="Lienhypertexte"/>
@@ -1619,7 +1757,7 @@
               <w:rPr>
                 <w:webHidden/>
               </w:rPr>
-              <w:instrText xml:space="preserve"> PAGEREF _Toc204249646 \h </w:instrText>
+              <w:instrText xml:space="preserve"> PAGEREF _Toc220081233 \h </w:instrText>
             </w:r>
             <w:r>
               <w:rPr>
@@ -1656,7 +1794,7 @@
               <w:szCs w:val="22"/>
             </w:rPr>
           </w:pPr>
-          <w:hyperlink w:anchor="_Toc204249647" w:history="1">
+          <w:hyperlink w:anchor="_Toc220081234" w:history="1">
             <w:r>
               <w:rPr>
                 <w:rStyle w:val="Lienhypertexte"/>
@@ -1694,7 +1832,7 @@
               <w:rPr>
                 <w:webHidden/>
               </w:rPr>
-              <w:instrText xml:space="preserve"> PAGEREF _Toc204249647 \h </w:instrText>
+              <w:instrText xml:space="preserve"> PAGEREF _Toc220081234 \h </w:instrText>
             </w:r>
             <w:r>
               <w:rPr>
@@ -1730,7 +1868,7 @@
               <w:szCs w:val="22"/>
             </w:rPr>
           </w:pPr>
-          <w:hyperlink w:anchor="_Toc204249648" w:history="1">
+          <w:hyperlink w:anchor="_Toc220081235" w:history="1">
             <w:r>
               <w:rPr>
                 <w:rStyle w:val="Lienhypertexte"/>
@@ -1767,7 +1905,7 @@
               <w:rPr>
                 <w:webHidden/>
               </w:rPr>
-              <w:instrText xml:space="preserve"> PAGEREF _Toc204249648 \h </w:instrText>
+              <w:instrText xml:space="preserve"> PAGEREF _Toc220081235 \h </w:instrText>
             </w:r>
             <w:r>
               <w:rPr>
@@ -1803,7 +1941,7 @@
               <w:szCs w:val="22"/>
             </w:rPr>
           </w:pPr>
-          <w:hyperlink w:anchor="_Toc204249649" w:history="1">
+          <w:hyperlink w:anchor="_Toc220081236" w:history="1">
             <w:r>
               <w:rPr>
                 <w:rStyle w:val="Lienhypertexte"/>
@@ -1840,7 +1978,7 @@
               <w:rPr>
                 <w:webHidden/>
               </w:rPr>
-              <w:instrText xml:space="preserve"> PAGEREF _Toc204249649 \h </w:instrText>
+              <w:instrText xml:space="preserve"> PAGEREF _Toc220081236 \h </w:instrText>
             </w:r>
             <w:r>
               <w:rPr>
@@ -1877,7 +2015,7 @@
               <w:szCs w:val="22"/>
             </w:rPr>
           </w:pPr>
-          <w:hyperlink w:anchor="_Toc204249650" w:history="1">
+          <w:hyperlink w:anchor="_Toc220081237" w:history="1">
             <w:r>
               <w:rPr>
                 <w:rStyle w:val="Lienhypertexte"/>
@@ -1915,7 +2053,7 @@
               <w:rPr>
                 <w:webHidden/>
               </w:rPr>
-              <w:instrText xml:space="preserve"> PAGEREF _Toc204249650 \h </w:instrText>
+              <w:instrText xml:space="preserve"> PAGEREF _Toc220081237 \h </w:instrText>
             </w:r>
             <w:r>
               <w:rPr>
@@ -1952,7 +2090,7 @@
               <w:szCs w:val="22"/>
             </w:rPr>
           </w:pPr>
-          <w:hyperlink w:anchor="_Toc204249651" w:history="1">
+          <w:hyperlink w:anchor="_Toc220081238" w:history="1">
             <w:r>
               <w:rPr>
                 <w:rStyle w:val="Lienhypertexte"/>
@@ -1990,7 +2128,7 @@
               <w:rPr>
                 <w:webHidden/>
               </w:rPr>
-              <w:instrText xml:space="preserve"> PAGEREF _Toc204249651 \h </w:instrText>
+              <w:instrText xml:space="preserve"> PAGEREF _Toc220081238 \h </w:instrText>
             </w:r>
             <w:r>
               <w:rPr>
@@ -2026,7 +2164,7 @@
               <w:szCs w:val="22"/>
             </w:rPr>
           </w:pPr>
-          <w:hyperlink w:anchor="_Toc204249652" w:history="1">
+          <w:hyperlink w:anchor="_Toc220081239" w:history="1">
             <w:r>
               <w:rPr>
                 <w:rStyle w:val="Lienhypertexte"/>
@@ -2063,7 +2201,7 @@
               <w:rPr>
                 <w:webHidden/>
               </w:rPr>
-              <w:instrText xml:space="preserve"> PAGEREF _Toc204249652 \h </w:instrText>
+              <w:instrText xml:space="preserve"> PAGEREF _Toc220081239 \h </w:instrText>
             </w:r>
             <w:r>
               <w:rPr>
@@ -2133,7 +2271,7 @@
       <w:pPr>
         <w:pStyle w:val="Titre1"/>
       </w:pPr>
-      <w:bookmarkStart w:id="0" w:name="_Toc204249643"/>
+      <w:bookmarkStart w:id="0" w:name="_Toc220081230"/>
       <w:r>
         <w:t>Prérequis</w:t>
       </w:r>
@@ -2151,30 +2289,14 @@
     </w:p>
     <w:p>
       <w:r>
-        <w:t>Ce plugin fonctionne uniquement avec des couches de la BDTopo, le nom de la couche route doit obligatoirement se nommer : « </w:t>
-      </w:r>
-      <w:proofErr w:type="spellStart"/>
-      <w:r>
-        <w:t>troncon_de_route</w:t>
-      </w:r>
-      <w:proofErr w:type="spellEnd"/>
-      <w:r>
-        <w:t> » dans QGIS.</w:t>
+        <w:t>Ce plugin fonctionne uniquement avec des couches de la BDTopo, le nom de la couche route doit obligatoirement se nommer : « troncon_de_route » dans QGIS.</w:t>
       </w:r>
     </w:p>
     <w:p/>
     <w:p>
       <w:bookmarkStart w:id="1" w:name="_Hlk183424290"/>
       <w:r>
-        <w:t>Si le package « </w:t>
-      </w:r>
-      <w:proofErr w:type="spellStart"/>
-      <w:r>
-        <w:t>openpyxl</w:t>
-      </w:r>
-      <w:proofErr w:type="spellEnd"/>
-      <w:r>
-        <w:t> » n’est pas installé sur le poste le message d’erreur ci-dessous apparait lors d’une transaction.</w:t>
+        <w:t>Si le package « openpyxl » n’est pas installé sur le poste le message d’erreur ci-dessous apparait lors d’une transaction.</w:t>
       </w:r>
       <w:bookmarkEnd w:id="1"/>
     </w:p>
@@ -2458,29 +2580,8 @@
         <w:t>python-qgis-ltr.bat</w:t>
       </w:r>
       <w:r>
-        <w:t xml:space="preserve"> -m </w:t>
-      </w:r>
-      <w:proofErr w:type="spellStart"/>
-      <w:r>
-        <w:t>pip</w:t>
-      </w:r>
-      <w:proofErr w:type="spellEnd"/>
-      <w:r>
-        <w:t xml:space="preserve"> </w:t>
-      </w:r>
-      <w:proofErr w:type="spellStart"/>
-      <w:r>
-        <w:t>install</w:t>
-      </w:r>
-      <w:proofErr w:type="spellEnd"/>
-      <w:r>
-        <w:t xml:space="preserve"> </w:t>
-      </w:r>
-      <w:proofErr w:type="spellStart"/>
-      <w:r>
-        <w:t>openpyxl</w:t>
-      </w:r>
-      <w:proofErr w:type="spellEnd"/>
+        <w:t xml:space="preserve"> -m pip install openpyxl</w:t>
+      </w:r>
     </w:p>
     <w:bookmarkEnd w:id="3"/>
     <w:p/>
@@ -2548,7 +2649,7 @@
       <w:pPr>
         <w:pStyle w:val="Titre1"/>
       </w:pPr>
-      <w:bookmarkStart w:id="5" w:name="_Toc204249644"/>
+      <w:bookmarkStart w:id="5" w:name="_Toc220081231"/>
       <w:r>
         <w:lastRenderedPageBreak/>
         <w:t>Résumé</w:t>
@@ -2570,10 +2671,16 @@
         <w:t xml:space="preserve"> des </w:t>
       </w:r>
       <w:r>
+        <w:t>« </w:t>
+      </w:r>
+      <w:r>
         <w:t>complexes DFCI</w:t>
       </w:r>
       <w:r>
         <w:t xml:space="preserve"> </w:t>
+      </w:r>
+      <w:r>
+        <w:t>».</w:t>
       </w:r>
     </w:p>
     <w:p/>
@@ -2582,7 +2689,7 @@
       <w:pPr>
         <w:pStyle w:val="Titre1"/>
       </w:pPr>
-      <w:bookmarkStart w:id="6" w:name="_Toc204249645"/>
+      <w:bookmarkStart w:id="6" w:name="_Toc220081232"/>
       <w:r>
         <w:t>Installation</w:t>
       </w:r>
@@ -2658,13 +2765,13 @@
         <w:br w:type="page"/>
       </w:r>
     </w:p>
-    <w:p/>
     <w:p>
       <w:pPr>
         <w:pStyle w:val="Titre1"/>
       </w:pPr>
-      <w:bookmarkStart w:id="7" w:name="_Toc204249646"/>
-      <w:r>
+      <w:bookmarkStart w:id="7" w:name="_Toc220081233"/>
+      <w:r>
+        <w:lastRenderedPageBreak/>
         <w:t>Présentation</w:t>
       </w:r>
       <w:bookmarkEnd w:id="7"/>
@@ -2676,14 +2783,11 @@
         <w:jc w:val="center"/>
       </w:pPr>
       <w:r>
-        <w:rPr>
-          <w:noProof/>
-        </w:rPr>
         <w:drawing>
-          <wp:inline distT="0" distB="0" distL="0" distR="0" wp14:anchorId="785D6A55" wp14:editId="398F347F">
-            <wp:extent cx="3076575" cy="5195992"/>
-            <wp:effectExtent l="0" t="0" r="0" b="5080"/>
-            <wp:docPr id="17" name="Image 17"/>
+          <wp:inline distT="0" distB="0" distL="0" distR="0" wp14:anchorId="0675432F" wp14:editId="7F1EB86A">
+            <wp:extent cx="1927824" cy="3333750"/>
+            <wp:effectExtent l="0" t="0" r="0" b="0"/>
+            <wp:docPr id="1" name="Image 1"/>
             <wp:cNvGraphicFramePr>
               <a:graphicFrameLocks xmlns:a="http://schemas.openxmlformats.org/drawingml/2006/main" noChangeAspect="1"/>
             </wp:cNvGraphicFramePr>
@@ -2691,17 +2795,11 @@
               <a:graphicData uri="http://schemas.openxmlformats.org/drawingml/2006/picture">
                 <pic:pic xmlns:pic="http://schemas.openxmlformats.org/drawingml/2006/picture">
                   <pic:nvPicPr>
-                    <pic:cNvPr id="17" name="Image 17"/>
+                    <pic:cNvPr id="1" name=""/>
                     <pic:cNvPicPr/>
                   </pic:nvPicPr>
                   <pic:blipFill>
-                    <a:blip r:embed="rId18">
-                      <a:extLst>
-                        <a:ext uri="{28A0092B-C50C-407E-A947-70E740481C1C}">
-                          <a14:useLocalDpi xmlns:a14="http://schemas.microsoft.com/office/drawing/2010/main" val="0"/>
-                        </a:ext>
-                      </a:extLst>
-                    </a:blip>
+                    <a:blip r:embed="rId18"/>
                     <a:stretch>
                       <a:fillRect/>
                     </a:stretch>
@@ -2709,7 +2807,7 @@
                   <pic:spPr>
                     <a:xfrm>
                       <a:off x="0" y="0"/>
-                      <a:ext cx="3080272" cy="5202237"/>
+                      <a:ext cx="1935582" cy="3347166"/>
                     </a:xfrm>
                     <a:prstGeom prst="rect">
                       <a:avLst/>
@@ -2863,10 +2961,9 @@
         </w:drawing>
       </w:r>
       <w:r>
-        <w:t xml:space="preserve"> Permet de modifier la couleur des tronçons sélectionnés dans QGIS. Ça peut être utile suivant la symbologie appliquées pour les tronçons dans QGIS.</w:t>
+        <w:t xml:space="preserve"> Permet de modifier la couleur des tronçons sélectionnés dans QGIS. Ça peut être utile suivant la symbologie appliquée pour les tronçons dans QGIS.</w:t>
       </w:r>
     </w:p>
-    <w:p/>
     <w:p>
       <w:r>
         <w:t xml:space="preserve">Le bouton </w:t>
@@ -2918,19 +3015,20 @@
         </w:drawing>
       </w:r>
       <w:r>
+        <w:t xml:space="preserve"> </w:t>
+      </w:r>
+      <w:r>
         <w:t>permet la sélection de toutes les entités comprises entre deux tronçons.</w:t>
       </w:r>
     </w:p>
     <w:p/>
     <w:p>
       <w:r>
-        <w:t xml:space="preserve">Le bouton « Valider les modifications&gt; valide les modifications dans QGIS, le plugin « espace collaboratif » se charge d’impacter les bases BDTopo de </w:t>
-      </w:r>
-      <w:proofErr w:type="spellStart"/>
-      <w:r>
-        <w:t>l’ign</w:t>
-      </w:r>
-      <w:proofErr w:type="spellEnd"/>
+        <w:t>Le bouton « Valider les modifications&gt; valide les modifications dans QGIS, le plugin « espace collaboratif » se charge d’impacter les bases BDTopo de l’</w:t>
+      </w:r>
+      <w:r>
+        <w:t xml:space="preserve"> IGN</w:t>
+      </w:r>
       <w:r>
         <w:t>.</w:t>
       </w:r>
@@ -2940,15 +3038,447 @@
         <w:spacing w:before="0" w:after="200" w:line="276" w:lineRule="auto"/>
         <w:jc w:val="left"/>
       </w:pPr>
-      <w:r>
-        <w:br w:type="page"/>
-      </w:r>
     </w:p>
     <w:p>
       <w:pPr>
+        <w:spacing w:before="0" w:after="200" w:line="276" w:lineRule="auto"/>
+        <w:jc w:val="left"/>
+      </w:pPr>
+      <w:r>
+        <w:rPr>
+          <w:noProof/>
+        </w:rPr>
+        <mc:AlternateContent>
+          <mc:Choice Requires="wps">
+            <w:drawing>
+              <wp:anchor distT="45720" distB="45720" distL="114300" distR="114300" simplePos="0" relativeHeight="251668480" behindDoc="0" locked="0" layoutInCell="1" allowOverlap="1" wp14:anchorId="67E3C746" wp14:editId="1878B722">
+                <wp:simplePos x="0" y="0"/>
+                <wp:positionH relativeFrom="column">
+                  <wp:posOffset>2105660</wp:posOffset>
+                </wp:positionH>
+                <wp:positionV relativeFrom="paragraph">
+                  <wp:posOffset>431165</wp:posOffset>
+                </wp:positionV>
+                <wp:extent cx="3746500" cy="1149350"/>
+                <wp:effectExtent l="0" t="0" r="6350" b="0"/>
+                <wp:wrapSquare wrapText="bothSides"/>
+                <wp:docPr id="14" name="Zone de texte 2"/>
+                <wp:cNvGraphicFramePr>
+                  <a:graphicFrameLocks xmlns:a="http://schemas.openxmlformats.org/drawingml/2006/main"/>
+                </wp:cNvGraphicFramePr>
+                <a:graphic xmlns:a="http://schemas.openxmlformats.org/drawingml/2006/main">
+                  <a:graphicData uri="http://schemas.microsoft.com/office/word/2010/wordprocessingShape">
+                    <wps:wsp>
+                      <wps:cNvSpPr txBox="1">
+                        <a:spLocks noChangeArrowheads="1"/>
+                      </wps:cNvSpPr>
+                      <wps:spPr bwMode="auto">
+                        <a:xfrm>
+                          <a:off x="0" y="0"/>
+                          <a:ext cx="3746500" cy="1149350"/>
+                        </a:xfrm>
+                        <a:prstGeom prst="rect">
+                          <a:avLst/>
+                        </a:prstGeom>
+                        <a:solidFill>
+                          <a:srgbClr val="FFFFFF"/>
+                        </a:solidFill>
+                        <a:ln w="9525">
+                          <a:noFill/>
+                          <a:miter lim="800000"/>
+                          <a:headEnd/>
+                          <a:tailEnd/>
+                        </a:ln>
+                      </wps:spPr>
+                      <wps:txbx>
+                        <w:txbxContent>
+                          <w:p>
+                            <w:r>
+                              <w:t xml:space="preserve">A l’ouverture de l’outil il y a une vérification de la présence dans le projet des couches nécessaires. Afficher l’état du modèle permet de </w:t>
+                            </w:r>
+                            <w:r>
+                              <w:rPr>
+                                <w:b/>
+                                <w:bCs/>
+                              </w:rPr>
+                              <w:t>vérifier les permissions sur chaque attribut</w:t>
+                            </w:r>
+                            <w:r>
+                              <w:t>. Ces permissions sont définies dans le projet en fonction des guichets en saisie directe dans la BDTOPO.</w:t>
+                            </w:r>
+                          </w:p>
+                          <w:p/>
+                        </w:txbxContent>
+                      </wps:txbx>
+                      <wps:bodyPr rot="0" vert="horz" wrap="square" lIns="91440" tIns="45720" rIns="91440" bIns="45720" anchor="t" anchorCtr="0">
+                        <a:noAutofit/>
+                      </wps:bodyPr>
+                    </wps:wsp>
+                  </a:graphicData>
+                </a:graphic>
+                <wp14:sizeRelH relativeFrom="margin">
+                  <wp14:pctWidth>0</wp14:pctWidth>
+                </wp14:sizeRelH>
+                <wp14:sizeRelV relativeFrom="margin">
+                  <wp14:pctHeight>0</wp14:pctHeight>
+                </wp14:sizeRelV>
+              </wp:anchor>
+            </w:drawing>
+          </mc:Choice>
+          <mc:Fallback>
+            <w:pict>
+              <v:shapetype w14:anchorId="67E3C746" id="_x0000_t202" coordsize="21600,21600" o:spt="202" path="m,l,21600r21600,l21600,xe">
+                <v:stroke joinstyle="miter"/>
+                <v:path gradientshapeok="t" o:connecttype="rect"/>
+              </v:shapetype>
+              <v:shape id="Zone de texte 2" o:spid="_x0000_s1026" type="#_x0000_t202" style="position:absolute;margin-left:165.8pt;margin-top:33.95pt;width:295pt;height:90.5pt;z-index:251668480;visibility:visible;mso-wrap-style:square;mso-width-percent:0;mso-height-percent:0;mso-wrap-distance-left:9pt;mso-wrap-distance-top:3.6pt;mso-wrap-distance-right:9pt;mso-wrap-distance-bottom:3.6pt;mso-position-horizontal:absolute;mso-position-horizontal-relative:text;mso-position-vertical:absolute;mso-position-vertical-relative:text;mso-width-percent:0;mso-height-percent:0;mso-width-relative:margin;mso-height-relative:margin;v-text-anchor:top" o:gfxdata="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" stroked="f">
+                <v:textbox>
+                  <w:txbxContent>
+                    <w:p>
+                      <w:r>
+                        <w:t xml:space="preserve">A l’ouverture de l’outil il y a une vérification de la présence dans le projet des couches nécessaires. Afficher l’état du modèle permet de </w:t>
+                      </w:r>
+                      <w:r>
+                        <w:rPr>
+                          <w:b/>
+                          <w:bCs/>
+                        </w:rPr>
+                        <w:t>vérifier les permissions sur chaque attribut</w:t>
+                      </w:r>
+                      <w:r>
+                        <w:t>. Ces permissions sont définies dans le projet en fonction des guichets en saisie directe dans la BDTOPO.</w:t>
+                      </w:r>
+                    </w:p>
+                    <w:p/>
+                  </w:txbxContent>
+                </v:textbox>
+                <w10:wrap type="square"/>
+              </v:shape>
+            </w:pict>
+          </mc:Fallback>
+        </mc:AlternateContent>
+      </w:r>
+      <w:r>
+        <w:rPr>
+          <w:noProof/>
+        </w:rPr>
+        <mc:AlternateContent>
+          <mc:Choice Requires="wps">
+            <w:drawing>
+              <wp:anchor distT="0" distB="0" distL="114300" distR="114300" simplePos="0" relativeHeight="251664384" behindDoc="0" locked="0" layoutInCell="1" allowOverlap="1" wp14:anchorId="4C7708FF" wp14:editId="1F6F4541">
+                <wp:simplePos x="0" y="0"/>
+                <wp:positionH relativeFrom="column">
+                  <wp:posOffset>607060</wp:posOffset>
+                </wp:positionH>
+                <wp:positionV relativeFrom="paragraph">
+                  <wp:posOffset>267335</wp:posOffset>
+                </wp:positionV>
+                <wp:extent cx="167723" cy="265044"/>
+                <wp:effectExtent l="0" t="0" r="80010" b="59055"/>
+                <wp:wrapNone/>
+                <wp:docPr id="17" name="Connecteur droit avec flèche 17"/>
+                <wp:cNvGraphicFramePr/>
+                <a:graphic xmlns:a="http://schemas.openxmlformats.org/drawingml/2006/main">
+                  <a:graphicData uri="http://schemas.microsoft.com/office/word/2010/wordprocessingShape">
+                    <wps:wsp>
+                      <wps:cNvCnPr/>
+                      <wps:spPr>
+                        <a:xfrm>
+                          <a:off x="0" y="0"/>
+                          <a:ext cx="167723" cy="265044"/>
+                        </a:xfrm>
+                        <a:prstGeom prst="straightConnector1">
+                          <a:avLst/>
+                        </a:prstGeom>
+                        <a:noFill/>
+                        <a:ln w="9525" cap="flat" cmpd="sng" algn="ctr">
+                          <a:solidFill>
+                            <a:srgbClr val="4F81BD">
+                              <a:shade val="95000"/>
+                              <a:satMod val="105000"/>
+                            </a:srgbClr>
+                          </a:solidFill>
+                          <a:prstDash val="solid"/>
+                          <a:tailEnd type="triangle"/>
+                        </a:ln>
+                        <a:effectLst/>
+                      </wps:spPr>
+                      <wps:bodyPr/>
+                    </wps:wsp>
+                  </a:graphicData>
+                </a:graphic>
+                <wp14:sizeRelH relativeFrom="margin">
+                  <wp14:pctWidth>0</wp14:pctWidth>
+                </wp14:sizeRelH>
+                <wp14:sizeRelV relativeFrom="margin">
+                  <wp14:pctHeight>0</wp14:pctHeight>
+                </wp14:sizeRelV>
+              </wp:anchor>
+            </w:drawing>
+          </mc:Choice>
+          <mc:Fallback>
+            <w:pict>
+              <v:shapetype w14:anchorId="1BD1A08B" id="_x0000_t32" coordsize="21600,21600" o:spt="32" o:oned="t" path="m,l21600,21600e" filled="f">
+                <v:path arrowok="t" fillok="f" o:connecttype="none"/>
+                <o:lock v:ext="edit" shapetype="t"/>
+              </v:shapetype>
+              <v:shape id="Connecteur droit avec flèche 17" o:spid="_x0000_s1026" type="#_x0000_t32" style="position:absolute;margin-left:47.8pt;margin-top:21.05pt;width:13.2pt;height:20.85pt;z-index:251664384;visibility:visible;mso-wrap-style:square;mso-width-percent:0;mso-height-percent:0;mso-wrap-distance-left:9pt;mso-wrap-distance-top:0;mso-wrap-distance-right:9pt;mso-wrap-distance-bottom:0;mso-position-horizontal:absolute;mso-position-horizontal-relative:text;mso-position-vertical:absolute;mso-position-vertical-relative:text;mso-width-percent:0;mso-height-percent:0;mso-width-relative:margin;mso-height-relative:margin" o:gfxdata="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" strokecolor="#4a7ebb">
+                <v:stroke endarrow="block"/>
+              </v:shape>
+            </w:pict>
+          </mc:Fallback>
+        </mc:AlternateContent>
+      </w:r>
+      <w:r>
+        <w:rPr>
+          <w:noProof/>
+        </w:rPr>
+        <w:drawing>
+          <wp:inline distT="0" distB="0" distL="0" distR="0" wp14:anchorId="16A2C4C6" wp14:editId="7D638CCF">
+            <wp:extent cx="1552792" cy="219106"/>
+            <wp:effectExtent l="0" t="0" r="0" b="9525"/>
+            <wp:docPr id="4" name="Image 4"/>
+            <wp:cNvGraphicFramePr>
+              <a:graphicFrameLocks xmlns:a="http://schemas.openxmlformats.org/drawingml/2006/main" noChangeAspect="1"/>
+            </wp:cNvGraphicFramePr>
+            <a:graphic xmlns:a="http://schemas.openxmlformats.org/drawingml/2006/main">
+              <a:graphicData uri="http://schemas.openxmlformats.org/drawingml/2006/picture">
+                <pic:pic xmlns:pic="http://schemas.openxmlformats.org/drawingml/2006/picture">
+                  <pic:nvPicPr>
+                    <pic:cNvPr id="1" name=""/>
+                    <pic:cNvPicPr/>
+                  </pic:nvPicPr>
+                  <pic:blipFill>
+                    <a:blip r:embed="rId22"/>
+                    <a:stretch>
+                      <a:fillRect/>
+                    </a:stretch>
+                  </pic:blipFill>
+                  <pic:spPr>
+                    <a:xfrm>
+                      <a:off x="0" y="0"/>
+                      <a:ext cx="1552792" cy="219106"/>
+                    </a:xfrm>
+                    <a:prstGeom prst="rect">
+                      <a:avLst/>
+                    </a:prstGeom>
+                  </pic:spPr>
+                </pic:pic>
+              </a:graphicData>
+            </a:graphic>
+          </wp:inline>
+        </w:drawing>
+      </w:r>
+    </w:p>
+    <w:p>
+      <w:pPr>
+        <w:spacing w:before="0" w:after="200" w:line="276" w:lineRule="auto"/>
+        <w:jc w:val="left"/>
+      </w:pPr>
+      <w:r>
+        <w:rPr>
+          <w:noProof/>
+        </w:rPr>
+        <mc:AlternateContent>
+          <mc:Choice Requires="wps">
+            <w:drawing>
+              <wp:anchor distT="45720" distB="45720" distL="114300" distR="114300" simplePos="0" relativeHeight="251666432" behindDoc="0" locked="0" layoutInCell="1" allowOverlap="1" wp14:anchorId="62EE6FFA" wp14:editId="2EC0EE9F">
+                <wp:simplePos x="0" y="0"/>
+                <wp:positionH relativeFrom="column">
+                  <wp:posOffset>314960</wp:posOffset>
+                </wp:positionH>
+                <wp:positionV relativeFrom="paragraph">
+                  <wp:posOffset>279400</wp:posOffset>
+                </wp:positionV>
+                <wp:extent cx="1346200" cy="1670050"/>
+                <wp:effectExtent l="0" t="0" r="6350" b="6350"/>
+                <wp:wrapSquare wrapText="bothSides"/>
+                <wp:docPr id="217" name="Zone de texte 2"/>
+                <wp:cNvGraphicFramePr>
+                  <a:graphicFrameLocks xmlns:a="http://schemas.openxmlformats.org/drawingml/2006/main"/>
+                </wp:cNvGraphicFramePr>
+                <a:graphic xmlns:a="http://schemas.openxmlformats.org/drawingml/2006/main">
+                  <a:graphicData uri="http://schemas.microsoft.com/office/word/2010/wordprocessingShape">
+                    <wps:wsp>
+                      <wps:cNvSpPr txBox="1">
+                        <a:spLocks noChangeArrowheads="1"/>
+                      </wps:cNvSpPr>
+                      <wps:spPr bwMode="auto">
+                        <a:xfrm>
+                          <a:off x="0" y="0"/>
+                          <a:ext cx="1346200" cy="1670050"/>
+                        </a:xfrm>
+                        <a:prstGeom prst="rect">
+                          <a:avLst/>
+                        </a:prstGeom>
+                        <a:solidFill>
+                          <a:srgbClr val="FFFFFF"/>
+                        </a:solidFill>
+                        <a:ln w="9525">
+                          <a:noFill/>
+                          <a:miter lim="800000"/>
+                          <a:headEnd/>
+                          <a:tailEnd/>
+                        </a:ln>
+                      </wps:spPr>
+                      <wps:txbx>
+                        <w:txbxContent>
+                          <w:p>
+                            <w:r>
+                              <w:rPr>
+                                <w:noProof/>
+                              </w:rPr>
+                              <w:drawing>
+                                <wp:inline distT="0" distB="0" distL="0" distR="0" wp14:anchorId="2D03FA9C" wp14:editId="30764EB4">
+                                  <wp:extent cx="920750" cy="1530169"/>
+                                  <wp:effectExtent l="0" t="0" r="0" b="0"/>
+                                  <wp:docPr id="13" name="Image 13"/>
+                                  <wp:cNvGraphicFramePr>
+                                    <a:graphicFrameLocks xmlns:a="http://schemas.openxmlformats.org/drawingml/2006/main" noChangeAspect="1"/>
+                                  </wp:cNvGraphicFramePr>
+                                  <a:graphic xmlns:a="http://schemas.openxmlformats.org/drawingml/2006/main">
+                                    <a:graphicData uri="http://schemas.openxmlformats.org/drawingml/2006/picture">
+                                      <pic:pic xmlns:pic="http://schemas.openxmlformats.org/drawingml/2006/picture">
+                                        <pic:nvPicPr>
+                                          <pic:cNvPr id="1" name=""/>
+                                          <pic:cNvPicPr/>
+                                        </pic:nvPicPr>
+                                        <pic:blipFill>
+                                          <a:blip r:embed="rId23"/>
+                                          <a:stretch>
+                                            <a:fillRect/>
+                                          </a:stretch>
+                                        </pic:blipFill>
+                                        <pic:spPr>
+                                          <a:xfrm>
+                                            <a:off x="0" y="0"/>
+                                            <a:ext cx="938134" cy="1559060"/>
+                                          </a:xfrm>
+                                          <a:prstGeom prst="rect">
+                                            <a:avLst/>
+                                          </a:prstGeom>
+                                        </pic:spPr>
+                                      </pic:pic>
+                                    </a:graphicData>
+                                  </a:graphic>
+                                </wp:inline>
+                              </w:drawing>
+                            </w:r>
+                          </w:p>
+                        </w:txbxContent>
+                      </wps:txbx>
+                      <wps:bodyPr rot="0" vert="horz" wrap="square" lIns="91440" tIns="45720" rIns="91440" bIns="45720" anchor="t" anchorCtr="0">
+                        <a:noAutofit/>
+                      </wps:bodyPr>
+                    </wps:wsp>
+                  </a:graphicData>
+                </a:graphic>
+                <wp14:sizeRelH relativeFrom="margin">
+                  <wp14:pctWidth>0</wp14:pctWidth>
+                </wp14:sizeRelH>
+                <wp14:sizeRelV relativeFrom="margin">
+                  <wp14:pctHeight>0</wp14:pctHeight>
+                </wp14:sizeRelV>
+              </wp:anchor>
+            </w:drawing>
+          </mc:Choice>
+          <mc:Fallback>
+            <w:pict>
+              <v:shape w14:anchorId="62EE6FFA" id="_x0000_s1027" type="#_x0000_t202" style="position:absolute;margin-left:24.8pt;margin-top:22pt;width:106pt;height:131.5pt;z-index:251666432;visibility:visible;mso-wrap-style:square;mso-width-percent:0;mso-height-percent:0;mso-wrap-distance-left:9pt;mso-wrap-distance-top:3.6pt;mso-wrap-distance-right:9pt;mso-wrap-distance-bottom:3.6pt;mso-position-horizontal:absolute;mso-position-horizontal-relative:text;mso-position-vertical:absolute;mso-position-vertical-relative:text;mso-width-percent:0;mso-height-percent:0;mso-width-relative:margin;mso-height-relative:margin;v-text-anchor:top" o:gfxdata="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" stroked="f">
+                <v:textbox>
+                  <w:txbxContent>
+                    <w:p>
+                      <w:r>
+                        <w:rPr>
+                          <w:noProof/>
+                        </w:rPr>
+                        <w:drawing>
+                          <wp:inline distT="0" distB="0" distL="0" distR="0" wp14:anchorId="2D03FA9C" wp14:editId="30764EB4">
+                            <wp:extent cx="920750" cy="1530169"/>
+                            <wp:effectExtent l="0" t="0" r="0" b="0"/>
+                            <wp:docPr id="13" name="Image 13"/>
+                            <wp:cNvGraphicFramePr>
+                              <a:graphicFrameLocks xmlns:a="http://schemas.openxmlformats.org/drawingml/2006/main" noChangeAspect="1"/>
+                            </wp:cNvGraphicFramePr>
+                            <a:graphic xmlns:a="http://schemas.openxmlformats.org/drawingml/2006/main">
+                              <a:graphicData uri="http://schemas.openxmlformats.org/drawingml/2006/picture">
+                                <pic:pic xmlns:pic="http://schemas.openxmlformats.org/drawingml/2006/picture">
+                                  <pic:nvPicPr>
+                                    <pic:cNvPr id="1" name=""/>
+                                    <pic:cNvPicPr/>
+                                  </pic:nvPicPr>
+                                  <pic:blipFill>
+                                    <a:blip r:embed="rId23"/>
+                                    <a:stretch>
+                                      <a:fillRect/>
+                                    </a:stretch>
+                                  </pic:blipFill>
+                                  <pic:spPr>
+                                    <a:xfrm>
+                                      <a:off x="0" y="0"/>
+                                      <a:ext cx="938134" cy="1559060"/>
+                                    </a:xfrm>
+                                    <a:prstGeom prst="rect">
+                                      <a:avLst/>
+                                    </a:prstGeom>
+                                  </pic:spPr>
+                                </pic:pic>
+                              </a:graphicData>
+                            </a:graphic>
+                          </wp:inline>
+                        </w:drawing>
+                      </w:r>
+                    </w:p>
+                  </w:txbxContent>
+                </v:textbox>
+                <w10:wrap type="square"/>
+              </v:shape>
+            </w:pict>
+          </mc:Fallback>
+        </mc:AlternateContent>
+      </w:r>
+    </w:p>
+    <w:p>
+      <w:pPr>
+        <w:spacing w:before="0" w:after="200" w:line="276" w:lineRule="auto"/>
+        <w:jc w:val="left"/>
+      </w:pPr>
+    </w:p>
+    <w:p>
+      <w:pPr>
+        <w:spacing w:before="0" w:after="200" w:line="276" w:lineRule="auto"/>
+        <w:jc w:val="left"/>
+      </w:pPr>
+    </w:p>
+    <w:p>
+      <w:pPr>
+        <w:spacing w:before="0" w:after="200" w:line="276" w:lineRule="auto"/>
+        <w:jc w:val="left"/>
+      </w:pPr>
+    </w:p>
+    <w:p>
+      <w:pPr>
+        <w:spacing w:before="0" w:after="200" w:line="276" w:lineRule="auto"/>
+        <w:jc w:val="left"/>
+      </w:pPr>
+    </w:p>
+    <w:p>
+      <w:pPr>
+        <w:spacing w:before="0" w:after="200" w:line="276" w:lineRule="auto"/>
+        <w:jc w:val="left"/>
+      </w:pPr>
+    </w:p>
+    <w:p>
+      <w:pPr>
+        <w:spacing w:before="0" w:after="200" w:line="276" w:lineRule="auto"/>
+        <w:jc w:val="left"/>
+      </w:pPr>
+    </w:p>
+    <w:p>
+      <w:pPr>
         <w:pStyle w:val="Titre1"/>
       </w:pPr>
-      <w:bookmarkStart w:id="8" w:name="_Toc204249647"/>
+      <w:bookmarkStart w:id="8" w:name="_Toc220081234"/>
       <w:r>
         <w:lastRenderedPageBreak/>
         <w:t>Mode de sélection</w:t>
@@ -2960,7 +3490,7 @@
       <w:pPr>
         <w:pStyle w:val="Titre2"/>
       </w:pPr>
-      <w:bookmarkStart w:id="9" w:name="_Toc204249648"/>
+      <w:bookmarkStart w:id="9" w:name="_Toc220081235"/>
       <w:r>
         <w:t>Sélection unique</w:t>
       </w:r>
@@ -2972,7 +3502,10 @@
         <w:ind w:firstLine="576"/>
       </w:pPr>
       <w:r>
-        <w:t>Les attributs affichés sont ceux du tronçon sélectionné ;</w:t>
+        <w:t>Les attributs affichés sont ceux du tronçon sélectionné</w:t>
+      </w:r>
+      <w:r>
+        <w:t> .</w:t>
       </w:r>
     </w:p>
     <w:p>
@@ -2990,14 +3523,9 @@
     </w:p>
     <w:p>
       <w:pPr>
-        <w:ind w:left="576"/>
-      </w:pPr>
-    </w:p>
-    <w:p>
-      <w:pPr>
         <w:pStyle w:val="Titre2"/>
       </w:pPr>
-      <w:bookmarkStart w:id="10" w:name="_Toc204249649"/>
+      <w:bookmarkStart w:id="10" w:name="_Toc220081236"/>
       <w:r>
         <w:t>Sélection multiple</w:t>
       </w:r>
@@ -3013,7 +3541,13 @@
         </w:numPr>
       </w:pPr>
       <w:r>
-        <w:t>Sélection multiple avec l’outil de saisi. Dans QGIS on peut sélectionner manuellement un ensemble de tronçons</w:t>
+        <w:t>Sélection multiple avec l’outil de saisi</w:t>
+      </w:r>
+      <w:r>
+        <w:t>e</w:t>
+      </w:r>
+      <w:r>
+        <w:t>. Dans QGIS on peut sélectionner manuellement un ensemble de tronçons</w:t>
       </w:r>
     </w:p>
     <w:p>
@@ -3049,7 +3583,13 @@
         <w:t>Ces 2 tronçons doivent être visible à l’écran et être connectés</w:t>
       </w:r>
       <w:r>
-        <w:t xml:space="preserve">. Ensuite en clique sur </w:t>
+        <w:t xml:space="preserve">. Ensuite </w:t>
+      </w:r>
+      <w:r>
+        <w:t>o</w:t>
+      </w:r>
+      <w:r>
+        <w:t xml:space="preserve">n clique sur </w:t>
       </w:r>
       <w:r>
         <w:rPr>
@@ -3098,7 +3638,13 @@
         </w:drawing>
       </w:r>
       <w:r>
-        <w:t xml:space="preserve">, le résultat est une sélection de tous les tronçons entre le premier et le deuxième sélectionné respectant l’algorithme du chemin le plus court. Un contrôle visuel est toutefois nécessaire afin de vérifier si les tronçons sont bien ceux </w:t>
+        <w:t>, le résultat est une sélection de tous les tronçons entre le premier et le deuxième sélectionné</w:t>
+      </w:r>
+      <w:r>
+        <w:t>s</w:t>
+      </w:r>
+      <w:r>
+        <w:t xml:space="preserve"> respectant l’algorithme du chemin le plus court. Un contrôle visuel est toutefois nécessaire afin de vérifier si les tronçons sont bien ceux </w:t>
       </w:r>
       <w:r>
         <w:t>désirés.</w:t>
@@ -3140,7 +3686,7 @@
       <w:bookmarkStart w:id="15" w:name="_Toc223425647"/>
       <w:bookmarkStart w:id="16" w:name="_Toc223756092"/>
       <w:bookmarkStart w:id="17" w:name="_Toc215049623"/>
-      <w:bookmarkStart w:id="18" w:name="_Toc204249650"/>
+      <w:bookmarkStart w:id="18" w:name="_Toc220081237"/>
       <w:bookmarkEnd w:id="11"/>
       <w:bookmarkEnd w:id="12"/>
       <w:bookmarkEnd w:id="13"/>
@@ -3165,7 +3711,7 @@
         <w:t>choisir le ou les attributs à modifier</w:t>
       </w:r>
       <w:r>
-        <w:t>.</w:t>
+        <w:t xml:space="preserve"> parmi les valeurs possibles ou éditables.</w:t>
       </w:r>
     </w:p>
     <w:p/>
@@ -3174,108 +3720,19 @@
         <w:rPr>
           <w:noProof/>
         </w:rPr>
-        <w:t xml:space="preserve"> </w:t>
-      </w:r>
-      <w:r>
-        <w:rPr>
-          <w:noProof/>
-        </w:rPr>
-        <w:tab/>
-      </w:r>
-      <w:r>
-        <w:rPr>
-          <w:noProof/>
-        </w:rPr>
-        <w:tab/>
-      </w:r>
-      <w:r>
-        <w:rPr>
-          <w:noProof/>
-        </w:rPr>
-        <w:tab/>
-      </w:r>
-      <w:r>
-        <w:rPr>
-          <w:noProof/>
-        </w:rPr>
-        <w:tab/>
-      </w:r>
-      <w:r>
-        <w:rPr>
-          <w:noProof/>
-        </w:rPr>
-        <w:drawing>
-          <wp:inline distT="0" distB="0" distL="0" distR="0" wp14:anchorId="5FA4637E" wp14:editId="44D5F4FE">
-            <wp:extent cx="2376000" cy="4010400"/>
-            <wp:effectExtent l="0" t="0" r="5715" b="0"/>
-            <wp:docPr id="20" name="Image 20"/>
-            <wp:cNvGraphicFramePr>
-              <a:graphicFrameLocks xmlns:a="http://schemas.openxmlformats.org/drawingml/2006/main" noChangeAspect="1"/>
-            </wp:cNvGraphicFramePr>
-            <a:graphic xmlns:a="http://schemas.openxmlformats.org/drawingml/2006/main">
-              <a:graphicData uri="http://schemas.openxmlformats.org/drawingml/2006/picture">
-                <pic:pic xmlns:pic="http://schemas.openxmlformats.org/drawingml/2006/picture">
-                  <pic:nvPicPr>
-                    <pic:cNvPr id="20" name="Image 20"/>
-                    <pic:cNvPicPr/>
-                  </pic:nvPicPr>
-                  <pic:blipFill>
-                    <a:blip r:embed="rId22">
-                      <a:extLst>
-                        <a:ext uri="{28A0092B-C50C-407E-A947-70E740481C1C}">
-                          <a14:useLocalDpi xmlns:a14="http://schemas.microsoft.com/office/drawing/2010/main" val="0"/>
-                        </a:ext>
-                      </a:extLst>
-                    </a:blip>
-                    <a:stretch>
-                      <a:fillRect/>
-                    </a:stretch>
-                  </pic:blipFill>
-                  <pic:spPr>
-                    <a:xfrm>
-                      <a:off x="0" y="0"/>
-                      <a:ext cx="2376000" cy="4010400"/>
-                    </a:xfrm>
-                    <a:prstGeom prst="rect">
-                      <a:avLst/>
-                    </a:prstGeom>
-                  </pic:spPr>
-                </pic:pic>
-              </a:graphicData>
-            </a:graphic>
-          </wp:inline>
-        </w:drawing>
-      </w:r>
-    </w:p>
-    <w:p/>
-    <w:p>
-      <w:r>
-        <w:t>Les attributs en rose seront ceux qui seront modifiés</w:t>
-      </w:r>
-      <w:r>
-        <w:t xml:space="preserve"> pour tous les tronçons sélectionnés.</w:t>
-      </w:r>
-    </w:p>
-    <w:p/>
-    <w:p>
-      <w:r>
-        <w:rPr>
-          <w:noProof/>
-        </w:rPr>
-        <w:lastRenderedPageBreak/>
         <mc:AlternateContent>
           <mc:Choice Requires="wps">
             <w:drawing>
-              <wp:anchor distT="91440" distB="91440" distL="137160" distR="137160" simplePos="0" relativeHeight="251662336" behindDoc="0" locked="0" layoutInCell="0" allowOverlap="1" wp14:anchorId="2B1F9824" wp14:editId="6AE99C31">
+              <wp:anchor distT="91440" distB="91440" distL="137160" distR="137160" simplePos="0" relativeHeight="251672576" behindDoc="0" locked="0" layoutInCell="0" allowOverlap="1" wp14:anchorId="066CD133" wp14:editId="4C55A2A3">
                 <wp:simplePos x="0" y="0"/>
                 <wp:positionH relativeFrom="margin">
-                  <wp:posOffset>2002790</wp:posOffset>
+                  <wp:posOffset>1757045</wp:posOffset>
                 </wp:positionH>
                 <wp:positionV relativeFrom="margin">
-                  <wp:posOffset>-266065</wp:posOffset>
+                  <wp:posOffset>6198870</wp:posOffset>
                 </wp:positionV>
-                <wp:extent cx="1149985" cy="4547870"/>
-                <wp:effectExtent l="0" t="3492" r="8572" b="8573"/>
+                <wp:extent cx="702945" cy="4023995"/>
+                <wp:effectExtent l="0" t="3175" r="0" b="0"/>
                 <wp:wrapSquare wrapText="bothSides"/>
                 <wp:docPr id="306" name="Forme automatique 2"/>
                 <wp:cNvGraphicFramePr>
@@ -3290,7 +3747,7 @@
                       <wps:spPr bwMode="auto">
                         <a:xfrm rot="5400000">
                           <a:off x="0" y="0"/>
-                          <a:ext cx="1149985" cy="4547870"/>
+                          <a:ext cx="702945" cy="4023995"/>
                         </a:xfrm>
                         <a:prstGeom prst="roundRect">
                           <a:avLst>
@@ -3305,21 +3762,8 @@
                         <w:txbxContent>
                           <w:p>
                             <w:r>
-                              <w:t xml:space="preserve">Attention : seule la base client est modifiée. Pour envoyer les modifications sur le serveur </w:t>
+                              <w:t>Attention : seule la base client est modifiée. Pour envoyer les modifications sur le serveur BDUni il faut le faire par l’intermédiaire du plugin espace collaboratif IGN, en cliquant sur l’enregistrement de la couche (disquette):</w:t>
                             </w:r>
-                            <w:proofErr w:type="spellStart"/>
-                            <w:r>
-                              <w:t>BDUni</w:t>
-                            </w:r>
-                            <w:proofErr w:type="spellEnd"/>
-                            <w:r>
-                              <w:t xml:space="preserve"> il faut le faire par l’intermédiaire du plugin espace collaboratif IGN, en cliquant sur l’enregistrement de la couche (disquette</w:t>
-                            </w:r>
-                            <w:proofErr w:type="gramStart"/>
-                            <w:r>
-                              <w:t>):</w:t>
-                            </w:r>
-                            <w:proofErr w:type="gramEnd"/>
                           </w:p>
                           <w:p>
                             <w:pPr>
@@ -3338,10 +3782,10 @@
                                 <w:noProof/>
                               </w:rPr>
                               <w:drawing>
-                                <wp:inline distT="0" distB="0" distL="0" distR="0" wp14:anchorId="6DB6FB23" wp14:editId="1FCD545E">
+                                <wp:inline distT="0" distB="0" distL="0" distR="0" wp14:anchorId="18827826" wp14:editId="60480BD1">
                                   <wp:extent cx="1152525" cy="409575"/>
                                   <wp:effectExtent l="0" t="0" r="9525" b="9525"/>
-                                  <wp:docPr id="25" name="Image 25"/>
+                                  <wp:docPr id="27" name="Image 27"/>
                                   <wp:cNvGraphicFramePr>
                                     <a:graphicFrameLocks xmlns:a="http://schemas.openxmlformats.org/drawingml/2006/main" noChangeAspect="1"/>
                                   </wp:cNvGraphicFramePr>
@@ -3353,7 +3797,7 @@
                                           <pic:cNvPicPr/>
                                         </pic:nvPicPr>
                                         <pic:blipFill>
-                                          <a:blip r:embed="rId23"/>
+                                          <a:blip r:embed="rId24"/>
                                           <a:stretch>
                                             <a:fillRect/>
                                           </a:stretch>
@@ -3385,6 +3829,19 @@
                               <w:t xml:space="preserve"> </w:t>
                             </w:r>
                           </w:p>
+                          <w:p>
+                            <w:pPr>
+                              <w:jc w:val="center"/>
+                              <w:rPr>
+                                <w:rFonts w:asciiTheme="majorHAnsi" w:eastAsiaTheme="majorEastAsia" w:hAnsiTheme="majorHAnsi" w:cstheme="majorBidi"/>
+                                <w:i/>
+                                <w:iCs/>
+                                <w:color w:val="FFFFFF" w:themeColor="background1"/>
+                                <w:sz w:val="28"/>
+                                <w:szCs w:val="28"/>
+                              </w:rPr>
+                            </w:pPr>
+                          </w:p>
                         </w:txbxContent>
                       </wps:txbx>
                       <wps:bodyPr rot="0" vert="horz" wrap="square" lIns="91440" tIns="45720" rIns="91440" bIns="45720" anchor="ctr" anchorCtr="0" upright="1">
@@ -3404,26 +3861,13 @@
           </mc:Choice>
           <mc:Fallback>
             <w:pict>
-              <v:roundrect w14:anchorId="2B1F9824" id="Forme automatique 2" o:spid="_x0000_s1026" style="position:absolute;left:0;text-align:left;margin-left:157.7pt;margin-top:-20.95pt;width:90.55pt;height:358.1pt;rotation:90;z-index:251662336;visibility:visible;mso-wrap-style:square;mso-width-percent:0;mso-height-percent:0;mso-wrap-distance-left:10.8pt;mso-wrap-distance-top:7.2pt;mso-wrap-distance-right:10.8pt;mso-wrap-distance-bottom:7.2pt;mso-position-horizontal:absolute;mso-position-horizontal-relative:margin;mso-position-vertical:absolute;mso-position-vertical-relative:margin;mso-width-percent:0;mso-height-percent:0;mso-width-relative:margin;mso-height-relative:margin;v-text-anchor:middle" arcsize="8541f" o:gfxdata="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" o:allowincell="f" fillcolor="#da4232" stroked="f">
+              <v:roundrect w14:anchorId="066CD133" id="Forme automatique 2" o:spid="_x0000_s1028" style="position:absolute;left:0;text-align:left;margin-left:138.35pt;margin-top:488.1pt;width:55.35pt;height:316.85pt;rotation:90;z-index:251672576;visibility:visible;mso-wrap-style:square;mso-width-percent:0;mso-height-percent:0;mso-wrap-distance-left:10.8pt;mso-wrap-distance-top:7.2pt;mso-wrap-distance-right:10.8pt;mso-wrap-distance-bottom:7.2pt;mso-position-horizontal:absolute;mso-position-horizontal-relative:margin;mso-position-vertical:absolute;mso-position-vertical-relative:margin;mso-width-percent:0;mso-height-percent:0;mso-width-relative:margin;mso-height-relative:margin;v-text-anchor:middle" arcsize="8541f" o:gfxdata="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" o:allowincell="f" fillcolor="#da4232" stroked="f">
                 <v:textbox>
                   <w:txbxContent>
                     <w:p>
                       <w:r>
-                        <w:t xml:space="preserve">Attention : seule la base client est modifiée. Pour envoyer les modifications sur le serveur </w:t>
+                        <w:t>Attention : seule la base client est modifiée. Pour envoyer les modifications sur le serveur BDUni il faut le faire par l’intermédiaire du plugin espace collaboratif IGN, en cliquant sur l’enregistrement de la couche (disquette):</w:t>
                       </w:r>
-                      <w:proofErr w:type="spellStart"/>
-                      <w:r>
-                        <w:t>BDUni</w:t>
-                      </w:r>
-                      <w:proofErr w:type="spellEnd"/>
-                      <w:r>
-                        <w:t xml:space="preserve"> il faut le faire par l’intermédiaire du plugin espace collaboratif IGN, en cliquant sur l’enregistrement de la couche (disquette</w:t>
-                      </w:r>
-                      <w:proofErr w:type="gramStart"/>
-                      <w:r>
-                        <w:t>):</w:t>
-                      </w:r>
-                      <w:proofErr w:type="gramEnd"/>
                     </w:p>
                     <w:p>
                       <w:pPr>
@@ -3442,10 +3886,10 @@
                           <w:noProof/>
                         </w:rPr>
                         <w:drawing>
-                          <wp:inline distT="0" distB="0" distL="0" distR="0" wp14:anchorId="6DB6FB23" wp14:editId="1FCD545E">
+                          <wp:inline distT="0" distB="0" distL="0" distR="0" wp14:anchorId="18827826" wp14:editId="60480BD1">
                             <wp:extent cx="1152525" cy="409575"/>
                             <wp:effectExtent l="0" t="0" r="9525" b="9525"/>
-                            <wp:docPr id="25" name="Image 25"/>
+                            <wp:docPr id="27" name="Image 27"/>
                             <wp:cNvGraphicFramePr>
                               <a:graphicFrameLocks xmlns:a="http://schemas.openxmlformats.org/drawingml/2006/main" noChangeAspect="1"/>
                             </wp:cNvGraphicFramePr>
@@ -3457,7 +3901,7 @@
                                     <pic:cNvPicPr/>
                                   </pic:nvPicPr>
                                   <pic:blipFill>
-                                    <a:blip r:embed="rId23"/>
+                                    <a:blip r:embed="rId24"/>
                                     <a:stretch>
                                       <a:fillRect/>
                                     </a:stretch>
@@ -3489,6 +3933,19 @@
                         <w:t xml:space="preserve"> </w:t>
                       </w:r>
                     </w:p>
+                    <w:p>
+                      <w:pPr>
+                        <w:jc w:val="center"/>
+                        <w:rPr>
+                          <w:rFonts w:asciiTheme="majorHAnsi" w:eastAsiaTheme="majorEastAsia" w:hAnsiTheme="majorHAnsi" w:cstheme="majorBidi"/>
+                          <w:i/>
+                          <w:iCs/>
+                          <w:color w:val="FFFFFF" w:themeColor="background1"/>
+                          <w:sz w:val="28"/>
+                          <w:szCs w:val="28"/>
+                        </w:rPr>
+                      </w:pPr>
+                    </w:p>
                   </w:txbxContent>
                 </v:textbox>
                 <w10:wrap type="square" anchorx="margin" anchory="margin"/>
@@ -3497,8 +3954,200 @@
           </mc:Fallback>
         </mc:AlternateContent>
       </w:r>
+      <w:r>
+        <w:rPr>
+          <w:noProof/>
+        </w:rPr>
+        <mc:AlternateContent>
+          <mc:Choice Requires="wps">
+            <w:drawing>
+              <wp:anchor distT="45720" distB="45720" distL="114300" distR="114300" simplePos="0" relativeHeight="251670528" behindDoc="0" locked="0" layoutInCell="1" allowOverlap="1" wp14:anchorId="0FEE8E48" wp14:editId="06D7244F">
+                <wp:simplePos x="0" y="0"/>
+                <wp:positionH relativeFrom="column">
+                  <wp:posOffset>2275840</wp:posOffset>
+                </wp:positionH>
+                <wp:positionV relativeFrom="paragraph">
+                  <wp:posOffset>952500</wp:posOffset>
+                </wp:positionV>
+                <wp:extent cx="2360930" cy="1404620"/>
+                <wp:effectExtent l="0" t="0" r="0" b="0"/>
+                <wp:wrapSquare wrapText="bothSides"/>
+                <wp:docPr id="24" name="Zone de texte 2"/>
+                <wp:cNvGraphicFramePr>
+                  <a:graphicFrameLocks xmlns:a="http://schemas.openxmlformats.org/drawingml/2006/main"/>
+                </wp:cNvGraphicFramePr>
+                <a:graphic xmlns:a="http://schemas.openxmlformats.org/drawingml/2006/main">
+                  <a:graphicData uri="http://schemas.microsoft.com/office/word/2010/wordprocessingShape">
+                    <wps:wsp>
+                      <wps:cNvSpPr txBox="1">
+                        <a:spLocks noChangeArrowheads="1"/>
+                      </wps:cNvSpPr>
+                      <wps:spPr bwMode="auto">
+                        <a:xfrm>
+                          <a:off x="0" y="0"/>
+                          <a:ext cx="2360930" cy="1404620"/>
+                        </a:xfrm>
+                        <a:prstGeom prst="rect">
+                          <a:avLst/>
+                        </a:prstGeom>
+                        <a:solidFill>
+                          <a:srgbClr val="FFFFFF"/>
+                        </a:solidFill>
+                        <a:ln w="9525">
+                          <a:noFill/>
+                          <a:miter lim="800000"/>
+                          <a:headEnd/>
+                          <a:tailEnd/>
+                        </a:ln>
+                      </wps:spPr>
+                      <wps:txbx>
+                        <w:txbxContent>
+                          <w:p>
+                            <w:r>
+                              <w:t xml:space="preserve">Les </w:t>
+                            </w:r>
+                            <w:r>
+                              <w:t xml:space="preserve">valeurs </w:t>
+                            </w:r>
+                            <w:r>
+                              <w:t>en rose sont ce</w:t>
+                            </w:r>
+                            <w:r>
+                              <w:t>lles</w:t>
+                            </w:r>
+                            <w:r>
+                              <w:t xml:space="preserve"> qui seront modifié</w:t>
+                            </w:r>
+                            <w:r>
+                              <w:t>e</w:t>
+                            </w:r>
+                            <w:r>
+                              <w:t>s pour tous les tronçons sélectionnés.</w:t>
+                            </w:r>
+                          </w:p>
+                        </w:txbxContent>
+                      </wps:txbx>
+                      <wps:bodyPr rot="0" vert="horz" wrap="square" lIns="91440" tIns="45720" rIns="91440" bIns="45720" anchor="t" anchorCtr="0">
+                        <a:spAutoFit/>
+                      </wps:bodyPr>
+                    </wps:wsp>
+                  </a:graphicData>
+                </a:graphic>
+                <wp14:sizeRelH relativeFrom="margin">
+                  <wp14:pctWidth>40000</wp14:pctWidth>
+                </wp14:sizeRelH>
+                <wp14:sizeRelV relativeFrom="margin">
+                  <wp14:pctHeight>20000</wp14:pctHeight>
+                </wp14:sizeRelV>
+              </wp:anchor>
+            </w:drawing>
+          </mc:Choice>
+          <mc:Fallback>
+            <w:pict>
+              <v:shape w14:anchorId="0FEE8E48" id="_x0000_s1029" type="#_x0000_t202" style="position:absolute;left:0;text-align:left;margin-left:179.2pt;margin-top:75pt;width:185.9pt;height:110.6pt;z-index:251670528;visibility:visible;mso-wrap-style:square;mso-width-percent:400;mso-height-percent:200;mso-wrap-distance-left:9pt;mso-wrap-distance-top:3.6pt;mso-wrap-distance-right:9pt;mso-wrap-distance-bottom:3.6pt;mso-position-horizontal:absolute;mso-position-horizontal-relative:text;mso-position-vertical:absolute;mso-position-vertical-relative:text;mso-width-percent:400;mso-height-percent:200;mso-width-relative:margin;mso-height-relative:margin;v-text-anchor:top" o:gfxdata="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" stroked="f">
+                <v:textbox style="mso-fit-shape-to-text:t">
+                  <w:txbxContent>
+                    <w:p>
+                      <w:r>
+                        <w:t xml:space="preserve">Les </w:t>
+                      </w:r>
+                      <w:r>
+                        <w:t xml:space="preserve">valeurs </w:t>
+                      </w:r>
+                      <w:r>
+                        <w:t>en rose sont ce</w:t>
+                      </w:r>
+                      <w:r>
+                        <w:t>lles</w:t>
+                      </w:r>
+                      <w:r>
+                        <w:t xml:space="preserve"> qui seront modifié</w:t>
+                      </w:r>
+                      <w:r>
+                        <w:t>e</w:t>
+                      </w:r>
+                      <w:r>
+                        <w:t>s pour tous les tronçons sélectionnés.</w:t>
+                      </w:r>
+                    </w:p>
+                  </w:txbxContent>
+                </v:textbox>
+                <w10:wrap type="square"/>
+              </v:shape>
+            </w:pict>
+          </mc:Fallback>
+        </mc:AlternateContent>
+      </w:r>
+      <w:r>
+        <w:t xml:space="preserve">              </w:t>
+      </w:r>
+      <w:r>
+        <w:rPr>
+          <w:noProof/>
+        </w:rPr>
+        <w:drawing>
+          <wp:inline distT="0" distB="0" distL="0" distR="0" wp14:anchorId="26E17F4A" wp14:editId="33DD04E3">
+            <wp:extent cx="1193800" cy="2014989"/>
+            <wp:effectExtent l="0" t="0" r="6350" b="4445"/>
+            <wp:docPr id="20" name="Image 20"/>
+            <wp:cNvGraphicFramePr>
+              <a:graphicFrameLocks xmlns:a="http://schemas.openxmlformats.org/drawingml/2006/main" noChangeAspect="1"/>
+            </wp:cNvGraphicFramePr>
+            <a:graphic xmlns:a="http://schemas.openxmlformats.org/drawingml/2006/main">
+              <a:graphicData uri="http://schemas.openxmlformats.org/drawingml/2006/picture">
+                <pic:pic xmlns:pic="http://schemas.openxmlformats.org/drawingml/2006/picture">
+                  <pic:nvPicPr>
+                    <pic:cNvPr id="20" name="Image 20"/>
+                    <pic:cNvPicPr/>
+                  </pic:nvPicPr>
+                  <pic:blipFill>
+                    <a:blip r:embed="rId25" cstate="print">
+                      <a:extLst>
+                        <a:ext uri="{28A0092B-C50C-407E-A947-70E740481C1C}">
+                          <a14:useLocalDpi xmlns:a14="http://schemas.microsoft.com/office/drawing/2010/main" val="0"/>
+                        </a:ext>
+                      </a:extLst>
+                    </a:blip>
+                    <a:stretch>
+                      <a:fillRect/>
+                    </a:stretch>
+                  </pic:blipFill>
+                  <pic:spPr>
+                    <a:xfrm>
+                      <a:off x="0" y="0"/>
+                      <a:ext cx="1199069" cy="2023882"/>
+                    </a:xfrm>
+                    <a:prstGeom prst="rect">
+                      <a:avLst/>
+                    </a:prstGeom>
+                  </pic:spPr>
+                </pic:pic>
+              </a:graphicData>
+            </a:graphic>
+          </wp:inline>
+        </w:drawing>
+      </w:r>
     </w:p>
-    <w:p/>
+    <w:p>
+      <w:r>
+        <w:rPr>
+          <w:noProof/>
+        </w:rPr>
+        <w:t xml:space="preserve"> </w:t>
+      </w:r>
+      <w:r>
+        <w:rPr>
+          <w:noProof/>
+        </w:rPr>
+        <w:tab/>
+      </w:r>
+      <w:r>
+        <w:rPr>
+          <w:noProof/>
+        </w:rPr>
+        <w:tab/>
+      </w:r>
+    </w:p>
     <w:p>
       <w:r>
         <w:t xml:space="preserve">Les modifications sur le(s) tronçon(s) sélectionné(s) sont à valider avec le bouton </w:t>
@@ -3523,7 +4172,7 @@
                     <pic:cNvPicPr/>
                   </pic:nvPicPr>
                   <pic:blipFill>
-                    <a:blip r:embed="rId24"/>
+                    <a:blip r:embed="rId26"/>
                     <a:stretch>
                       <a:fillRect/>
                     </a:stretch>
@@ -3570,7 +4219,7 @@
                     <pic:cNvPicPr/>
                   </pic:nvPicPr>
                   <pic:blipFill>
-                    <a:blip r:embed="rId25"/>
+                    <a:blip r:embed="rId27"/>
                     <a:stretch>
                       <a:fillRect/>
                     </a:stretch>
@@ -3608,8 +4257,9 @@
       <w:pPr>
         <w:pStyle w:val="Titre1"/>
       </w:pPr>
-      <w:bookmarkStart w:id="19" w:name="_Toc204249651"/>
-      <w:r>
+      <w:bookmarkStart w:id="19" w:name="_Toc220081238"/>
+      <w:r>
+        <w:lastRenderedPageBreak/>
         <w:t>Extra</w:t>
       </w:r>
       <w:bookmarkEnd w:id="19"/>
@@ -3627,7 +4277,7 @@
         <w:pStyle w:val="Titre2"/>
       </w:pPr>
       <w:bookmarkStart w:id="20" w:name="_Toc182399295"/>
-      <w:bookmarkStart w:id="21" w:name="_Toc204249652"/>
+      <w:bookmarkStart w:id="21" w:name="_Toc220081239"/>
       <w:r>
         <w:t>A propos de</w:t>
       </w:r>
@@ -3666,7 +4316,7 @@
                     <pic:cNvPicPr/>
                   </pic:nvPicPr>
                   <pic:blipFill>
-                    <a:blip r:embed="rId26">
+                    <a:blip r:embed="rId28">
                       <a:extLst>
                         <a:ext uri="{28A0092B-C50C-407E-A947-70E740481C1C}">
                           <a14:useLocalDpi xmlns:a14="http://schemas.microsoft.com/office/drawing/2010/main" val="0"/>
@@ -3700,14 +4350,19 @@
       <w:pPr>
         <w:ind w:firstLine="576"/>
       </w:pPr>
+    </w:p>
+    <w:p>
+      <w:pPr>
+        <w:ind w:firstLine="576"/>
+      </w:pPr>
       <w:r>
         <w:rPr>
           <w:noProof/>
         </w:rPr>
         <w:drawing>
-          <wp:inline distT="0" distB="0" distL="0" distR="0" wp14:anchorId="753C13A9" wp14:editId="38077A32">
-            <wp:extent cx="4782217" cy="2419688"/>
-            <wp:effectExtent l="0" t="0" r="0" b="0"/>
+          <wp:inline distT="0" distB="0" distL="0" distR="0" wp14:anchorId="753C13A9" wp14:editId="41E395AC">
+            <wp:extent cx="2971800" cy="1503660"/>
+            <wp:effectExtent l="0" t="0" r="0" b="1905"/>
             <wp:docPr id="22" name="Image 22"/>
             <wp:cNvGraphicFramePr>
               <a:graphicFrameLocks xmlns:a="http://schemas.openxmlformats.org/drawingml/2006/main" noChangeAspect="1"/>
@@ -3720,7 +4375,7 @@
                     <pic:cNvPicPr/>
                   </pic:nvPicPr>
                   <pic:blipFill>
-                    <a:blip r:embed="rId27">
+                    <a:blip r:embed="rId29">
                       <a:extLst>
                         <a:ext uri="{28A0092B-C50C-407E-A947-70E740481C1C}">
                           <a14:useLocalDpi xmlns:a14="http://schemas.microsoft.com/office/drawing/2010/main" val="0"/>
@@ -3734,7 +4389,7 @@
                   <pic:spPr>
                     <a:xfrm>
                       <a:off x="0" y="0"/>
-                      <a:ext cx="4782217" cy="2419688"/>
+                      <a:ext cx="2989919" cy="1512828"/>
                     </a:xfrm>
                     <a:prstGeom prst="rect">
                       <a:avLst/>
@@ -3775,8 +4430,8 @@
       </w:pPr>
     </w:p>
     <w:sectPr>
-      <w:footerReference w:type="default" r:id="rId28"/>
-      <w:footerReference w:type="first" r:id="rId29"/>
+      <w:footerReference w:type="default" r:id="rId30"/>
+      <w:footerReference w:type="first" r:id="rId31"/>
       <w:pgSz w:w="11906" w:h="16838" w:code="9"/>
       <w:pgMar w:top="851" w:right="924" w:bottom="1616" w:left="1134" w:header="709" w:footer="607" w:gutter="0"/>
       <w:cols w:space="708"/>
@@ -4010,7 +4665,7 @@
             <w:tag w:val="_DCDateCreated"/>
             <w:id w:val="317545533"/>
             <w:dataBinding w:prefixMappings="xmlns:ns0='http://schemas.microsoft.com/office/2006/metadata/properties' xmlns:ns1='http://www.w3.org/2001/XMLSchema-instance' xmlns:ns2='http://schemas.microsoft.com/office/infopath/2007/PartnerControls' xmlns:ns3='a1322699-2fbb-4cce-8aba-176c4fa97253' xmlns:ns4='http://schemas.microsoft.com/sharepoint/v3' xmlns:ns5='http://schemas.microsoft.com/sharepoint/v3/fields' xmlns:ns6='f0ff482e-aa3b-417e-9d65-5f4cb2656651' " w:xpath="/ns0:properties[1]/documentManagement[1]/ns5:_DCDateCreated[1]" w:storeItemID="{1159403A-C237-488E-8C5E-DABF9FCE7043}"/>
-            <w:date w:fullDate="2025-07-24T00:00:00Z">
+            <w:date w:fullDate="2026-01-23T00:00:00Z">
               <w:dateFormat w:val="dd/MM/yyyy"/>
               <w:lid w:val="fr-FR"/>
               <w:storeMappedDataAs w:val="dateTime"/>
@@ -4044,17 +4699,7 @@
                   <w:sz w:val="16"/>
                   <w:szCs w:val="16"/>
                 </w:rPr>
-                <w:t>24/07</w:t>
-              </w:r>
-              <w:r>
-                <w:rPr>
-                  <w:rFonts w:eastAsia="Calibri"/>
-                  <w:noProof/>
-                  <w:color w:val="002060"/>
-                  <w:sz w:val="16"/>
-                  <w:szCs w:val="16"/>
-                </w:rPr>
-                <w:t>/2025</w:t>
+                <w:t>23/01/2026</w:t>
               </w:r>
             </w:p>
           </w:sdtContent>
@@ -4305,7 +4950,7 @@
         <v:path o:extrusionok="f" gradientshapeok="t" o:connecttype="rect"/>
         <o:lock v:ext="edit" aspectratio="t"/>
       </v:shapetype>
-      <v:shape id="_x0000_i1077" type="#_x0000_t75" style="width:30.75pt;height:52.35pt" o:bullet="t">
+      <v:shape id="_x0000_i1168" type="#_x0000_t75" style="width:30.75pt;height:52.35pt" o:bullet="t">
         <v:imagedata r:id="rId1" o:title="puce"/>
       </v:shape>
     </w:pict>
@@ -9415,7 +10060,7 @@
     <w:charset w:val="00"/>
     <w:family w:val="swiss"/>
     <w:pitch w:val="variable"/>
-    <w:sig w:usb0="E4002EFF" w:usb1="C000247B" w:usb2="00000009" w:usb3="00000000" w:csb0="000001FF" w:csb1="00000000"/>
+    <w:sig w:usb0="E4002EFF" w:usb1="C200247B" w:usb2="00000009" w:usb3="00000000" w:csb0="000001FF" w:csb1="00000000"/>
   </w:font>
   <w:font w:name="Tahoma">
     <w:panose1 w:val="020B0604030504040204"/>
@@ -9443,7 +10088,7 @@
     <w:charset w:val="00"/>
     <w:family w:val="swiss"/>
     <w:pitch w:val="variable"/>
-    <w:sig w:usb0="E4002EFF" w:usb1="C000247B" w:usb2="00000009" w:usb3="00000000" w:csb0="000001FF" w:csb1="00000000"/>
+    <w:sig w:usb0="A0002AEF" w:usb1="4000207B" w:usb2="00000000" w:usb3="00000000" w:csb0="000001FF" w:csb1="00000000"/>
   </w:font>
 </w:fonts>
 </file>
@@ -9485,6 +10130,7 @@
     <w:rsid w:val="00B143EC"/>
     <w:rsid w:val="00B65088"/>
     <w:rsid w:val="00B82D9E"/>
+    <w:rsid w:val="00BC6EB5"/>
     <w:rsid w:val="00C13EA8"/>
     <w:rsid w:val="00C2639B"/>
     <w:rsid w:val="00C4071C"/>
@@ -10266,6 +10912,15 @@
 
 <file path=customXml/item1.xml><?xml version="1.0" encoding="utf-8"?>
 <?mso-contentType ?>
+<FormTemplates xmlns="http://schemas.microsoft.com/sharepoint/v3/contenttype/forms">
+  <Display>DocumentLibraryForm</Display>
+  <Edit>DocumentLibraryForm</Edit>
+  <New>DocumentLibraryForm</New>
+</FormTemplates>
+</file>
+
+<file path=customXml/item2.xml><?xml version="1.0" encoding="utf-8"?>
+<?mso-contentType ?>
 <spe:Receivers xmlns:spe="http://schemas.microsoft.com/sharepoint/events">
   <Receiver>
     <Name>Document ID Generator</Name>
@@ -10310,115 +10965,11 @@
 </spe:Receivers>
 </file>
 
-<file path=customXml/item2.xml><?xml version="1.0" encoding="utf-8"?>
-<?mso-contentType ?>
-<FormTemplates xmlns="http://schemas.microsoft.com/sharepoint/v3/contenttype/forms">
-  <Display>DocumentLibraryForm</Display>
-  <Edit>DocumentLibraryForm</Edit>
-  <New>DocumentLibraryForm</New>
-</FormTemplates>
-</file>
-
 <file path=customXml/item3.xml><?xml version="1.0" encoding="utf-8"?>
-<p:properties xmlns:p="http://schemas.microsoft.com/office/2006/metadata/properties" xmlns:xsi="http://www.w3.org/2001/XMLSchema-instance" xmlns:pc="http://schemas.microsoft.com/office/infopath/2007/PartnerControls">
-  <documentManagement>
-    <redacteur xmlns="a1322699-2fbb-4cce-8aba-176c4fa97253">
-      <UserInfo>
-        <DisplayName>Annie Cazaux</DisplayName>
-        <AccountId>62</AccountId>
-        <AccountType/>
-      </UserInfo>
-    </redacteur>
-    <Language xmlns="http://schemas.microsoft.com/sharepoint/v3">Français (France)</Language>
-    <_Source xmlns="http://schemas.microsoft.com/sharepoint/v3/fields" xsi:nil="true"/>
-    <Version_IGN xmlns="a1322699-2fbb-4cce-8aba-176c4fa97253">1.0.0</Version_IGN>
-    <p17c2b7c625547a3b70510fd871aaba1 xmlns="a1322699-2fbb-4cce-8aba-176c4fa97253">
-      <Terms xmlns="http://schemas.microsoft.com/office/infopath/2007/PartnerControls">
-        <TermInfo xmlns="http://schemas.microsoft.com/office/infopath/2007/PartnerControls">
-          <TermName xmlns="http://schemas.microsoft.com/office/infopath/2007/PartnerControls">DQ</TermName>
-          <TermId xmlns="http://schemas.microsoft.com/office/infopath/2007/PartnerControls">e69b0690-0cfb-4cfe-87d3-81f79ec19881</TermId>
-        </TermInfo>
-      </Terms>
-    </p17c2b7c625547a3b70510fd871aaba1>
-    <Autres_redacteurs xmlns="a1322699-2fbb-4cce-8aba-176c4fa97253">Thierry Prin</Autres_redacteurs>
-    <_DCDateModified xmlns="http://schemas.microsoft.com/sharepoint/v3/fields" xsi:nil="true"/>
-    <_Publisher xmlns="http://schemas.microsoft.com/sharepoint/v3/fields" xsi:nil="true"/>
-    <Gestionnaire xmlns="a1322699-2fbb-4cce-8aba-176c4fa97253">
-      <UserInfo>
-        <DisplayName>Annie Cazaux</DisplayName>
-        <AccountId>62</AccountId>
-        <AccountType/>
-      </UserInfo>
-    </Gestionnaire>
-    <Identifiant_IGN xmlns="a1322699-2fbb-4cce-8aba-176c4fa97253">MV_Modele-procedure</Identifiant_IGN>
-    <_Relation xmlns="http://schemas.microsoft.com/sharepoint/v3/fields" xsi:nil="true"/>
-    <o062e75b76fd4c2ab45f41497e4c179e xmlns="a1322699-2fbb-4cce-8aba-176c4fa97253">
-      <Terms xmlns="http://schemas.microsoft.com/office/infopath/2007/PartnerControls">
-        <TermInfo xmlns="http://schemas.microsoft.com/office/infopath/2007/PartnerControls">
-          <TermName xmlns="http://schemas.microsoft.com/office/infopath/2007/PartnerControls">Système de management</TermName>
-          <TermId xmlns="http://schemas.microsoft.com/office/infopath/2007/PartnerControls">7207f030-094e-4e6f-b355-e7655c1fbf97</TermId>
-        </TermInfo>
-      </Terms>
-    </o062e75b76fd4c2ab45f41497e4c179e>
-    <c1cc88710d9c4c84af372a6a51dc9d60 xmlns="a1322699-2fbb-4cce-8aba-176c4fa97253">
-      <Terms xmlns="http://schemas.microsoft.com/office/infopath/2007/PartnerControls"/>
-    </c1cc88710d9c4c84af372a6a51dc9d60>
-    <TaxCatchAll xmlns="a1322699-2fbb-4cce-8aba-176c4fa97253">
-      <Value>7</Value>
-      <Value>17</Value>
-    </TaxCatchAll>
-    <Diffusion xmlns="a1322699-2fbb-4cce-8aba-176c4fa97253">Interne</Diffusion>
-    <Approbateur xmlns="a1322699-2fbb-4cce-8aba-176c4fa97253">
-      <UserInfo>
-        <DisplayName>IGN\tprin</DisplayName>
-        <AccountId>126</AccountId>
-        <AccountType/>
-      </UserInfo>
-    </Approbateur>
-    <_Contributor xmlns="http://schemas.microsoft.com/sharepoint/v3/fields" xsi:nil="true"/>
-    <_Format xmlns="http://schemas.microsoft.com/sharepoint/v3/fields" xsi:nil="true"/>
-    <bb80de6026714cfbab5aa06ad8fd5f59 xmlns="a1322699-2fbb-4cce-8aba-176c4fa97253">
-      <Terms xmlns="http://schemas.microsoft.com/office/infopath/2007/PartnerControls"/>
-    </bb80de6026714cfbab5aa06ad8fd5f59>
-    <_Coverage xmlns="http://schemas.microsoft.com/sharepoint/v3/fields" xsi:nil="true"/>
-    <Date_approbation xmlns="a1322699-2fbb-4cce-8aba-176c4fa97253">2025-01-10T00:00:00</Date_approbation>
-    <_Identifier xmlns="http://schemas.microsoft.com/sharepoint/v3/fields">QUALITÉ-2015-P-776</_Identifier>
-    <_ResourceType xmlns="http://schemas.microsoft.com/sharepoint/v3/fields" xsi:nil="true"/>
-    <_RightsManagement xmlns="http://schemas.microsoft.com/sharepoint/v3/fields" xsi:nil="true"/>
-    <Relecteur xmlns="a1322699-2fbb-4cce-8aba-176c4fa97253">
-      <UserInfo>
-        <DisplayName>IGN\mlouyot</DisplayName>
-        <AccountId>3</AccountId>
-        <AccountType/>
-      </UserInfo>
-      <UserInfo>
-        <DisplayName>IGN\SPaquier</DisplayName>
-        <AccountId>199</AccountId>
-        <AccountType/>
-      </UserInfo>
-    </Relecteur>
-    <Typologie xmlns="a1322699-2fbb-4cce-8aba-176c4fa97253">Modèle Vierge et formulaire</Typologie>
-    <Statut xmlns="a1322699-2fbb-4cce-8aba-176c4fa97253">Finalisé mais non validé</Statut>
-    <Alias_IGN xmlns="a1322699-2fbb-4cce-8aba-176c4fa97253">Résolution des résultats d’appariement des noms de voies et de lieux-dits</Alias_IGN>
-    <Ancienne_référence xmlns="a1322699-2fbb-4cce-8aba-176c4fa97253" xsi:nil="true"/>
-    <Code_typologie xmlns="a1322699-2fbb-4cce-8aba-176c4fa97253" xsi:nil="true"/>
-    <_DCDateCreated xmlns="http://schemas.microsoft.com/sharepoint/v3/fields">2025-07-23T22:00:00Z</_DCDateCreated>
-    <Date_fin_validite xmlns="a1322699-2fbb-4cce-8aba-176c4fa97253" xsi:nil="true"/>
-    <_dlc_DocId xmlns="f0ff482e-aa3b-417e-9d65-5f4cb2656651">UYVM5YNHQ4HK-30-776</_dlc_DocId>
-    <_dlc_DocIdUrl xmlns="f0ff482e-aa3b-417e-9d65-5f4cb2656651">
-      <Url>http://intradoc.ign.fr/ged/DG/QSE/_layouts/DocIdRedir.aspx?ID=UYVM5YNHQ4HK-30-776</Url>
-      <Description>UYVM5YNHQ4HK-30-776</Description>
-    </_dlc_DocIdUrl>
-  </documentManagement>
-</p:properties>
+<b:Sources xmlns:b="http://schemas.openxmlformats.org/officeDocument/2006/bibliography" xmlns="http://schemas.openxmlformats.org/officeDocument/2006/bibliography" SelectedStyle="\APA.XSL" StyleName="APA"/>
 </file>
 
 <file path=customXml/item4.xml><?xml version="1.0" encoding="utf-8"?>
-<?mso-contentType ?>
-<SharedContentType xmlns="Microsoft.SharePoint.Taxonomy.ContentTypeSync" SourceId="11ad8b72-dc11-4d56-b05b-950e088cc514" ContentTypeId="0x01010B0081A137466272CF4BAC585A26022CFF1407" PreviousValue="false"/>
-</file>
-
-<file path=customXml/item5.xml><?xml version="1.0" encoding="utf-8"?>
 <ct:contentTypeSchema xmlns:ct="http://schemas.microsoft.com/office/2006/metadata/contentType" xmlns:ma="http://schemas.microsoft.com/office/2006/metadata/properties/metaAttributes" ct:_="" ma:_="" ma:contentTypeName="Modèle Vierge et formulaire" ma:contentTypeID="0x01010B0081A137466272CF4BAC585A26022CFF140700EC48CC62CD0ABD4F9840E839EA1E2732" ma:contentTypeVersion="201" ma:contentTypeDescription="MV" ma:contentTypeScope="" ma:versionID="2bd623b5a594494cd4a3ae1614ea3844">
   <xsd:schema xmlns:xsd="http://www.w3.org/2001/XMLSchema" xmlns:xs="http://www.w3.org/2001/XMLSchema" xmlns:p="http://schemas.microsoft.com/office/2006/metadata/properties" xmlns:ns1="a1322699-2fbb-4cce-8aba-176c4fa97253" xmlns:ns2="http://schemas.microsoft.com/sharepoint/v3/fields" xmlns:ns3="http://schemas.microsoft.com/sharepoint/v3" xmlns:ns4="f0ff482e-aa3b-417e-9d65-5f4cb2656651" targetNamespace="http://schemas.microsoft.com/office/2006/metadata/properties" ma:root="true" ma:fieldsID="e73f26e8e3603672e51fd804f7ff859e" ns1:_="" ns2:_="" ns3:_="" ns4:_="">
     <xsd:import namespace="a1322699-2fbb-4cce-8aba-176c4fa97253"/>
@@ -10926,11 +11477,114 @@
 </ct:contentTypeSchema>
 </file>
 
+<file path=customXml/item5.xml><?xml version="1.0" encoding="utf-8"?>
+<?mso-contentType ?>
+<SharedContentType xmlns="Microsoft.SharePoint.Taxonomy.ContentTypeSync" SourceId="11ad8b72-dc11-4d56-b05b-950e088cc514" ContentTypeId="0x01010B0081A137466272CF4BAC585A26022CFF1407" PreviousValue="false"/>
+</file>
+
 <file path=customXml/item6.xml><?xml version="1.0" encoding="utf-8"?>
-<b:Sources xmlns:b="http://schemas.openxmlformats.org/officeDocument/2006/bibliography" xmlns="http://schemas.openxmlformats.org/officeDocument/2006/bibliography" SelectedStyle="\APA.XSL" StyleName="APA"/>
+<p:properties xmlns:p="http://schemas.microsoft.com/office/2006/metadata/properties" xmlns:xsi="http://www.w3.org/2001/XMLSchema-instance" xmlns:pc="http://schemas.microsoft.com/office/infopath/2007/PartnerControls">
+  <documentManagement>
+    <redacteur xmlns="a1322699-2fbb-4cce-8aba-176c4fa97253">
+      <UserInfo>
+        <DisplayName>Annie Cazaux</DisplayName>
+        <AccountId>62</AccountId>
+        <AccountType/>
+      </UserInfo>
+    </redacteur>
+    <Language xmlns="http://schemas.microsoft.com/sharepoint/v3">Français (France)</Language>
+    <_Source xmlns="http://schemas.microsoft.com/sharepoint/v3/fields" xsi:nil="true"/>
+    <Version_IGN xmlns="a1322699-2fbb-4cce-8aba-176c4fa97253">1.1.0</Version_IGN>
+    <p17c2b7c625547a3b70510fd871aaba1 xmlns="a1322699-2fbb-4cce-8aba-176c4fa97253">
+      <Terms xmlns="http://schemas.microsoft.com/office/infopath/2007/PartnerControls">
+        <TermInfo xmlns="http://schemas.microsoft.com/office/infopath/2007/PartnerControls">
+          <TermName xmlns="http://schemas.microsoft.com/office/infopath/2007/PartnerControls">DQ</TermName>
+          <TermId xmlns="http://schemas.microsoft.com/office/infopath/2007/PartnerControls">e69b0690-0cfb-4cfe-87d3-81f79ec19881</TermId>
+        </TermInfo>
+      </Terms>
+    </p17c2b7c625547a3b70510fd871aaba1>
+    <Autres_redacteurs xmlns="a1322699-2fbb-4cce-8aba-176c4fa97253">Thierry Prin</Autres_redacteurs>
+    <_DCDateModified xmlns="http://schemas.microsoft.com/sharepoint/v3/fields" xsi:nil="true"/>
+    <_Publisher xmlns="http://schemas.microsoft.com/sharepoint/v3/fields" xsi:nil="true"/>
+    <Gestionnaire xmlns="a1322699-2fbb-4cce-8aba-176c4fa97253">
+      <UserInfo>
+        <DisplayName>Annie Cazaux</DisplayName>
+        <AccountId>62</AccountId>
+        <AccountType/>
+      </UserInfo>
+    </Gestionnaire>
+    <Identifiant_IGN xmlns="a1322699-2fbb-4cce-8aba-176c4fa97253">MV_Modele-procedure</Identifiant_IGN>
+    <_Relation xmlns="http://schemas.microsoft.com/sharepoint/v3/fields" xsi:nil="true"/>
+    <o062e75b76fd4c2ab45f41497e4c179e xmlns="a1322699-2fbb-4cce-8aba-176c4fa97253">
+      <Terms xmlns="http://schemas.microsoft.com/office/infopath/2007/PartnerControls">
+        <TermInfo xmlns="http://schemas.microsoft.com/office/infopath/2007/PartnerControls">
+          <TermName xmlns="http://schemas.microsoft.com/office/infopath/2007/PartnerControls">Système de management</TermName>
+          <TermId xmlns="http://schemas.microsoft.com/office/infopath/2007/PartnerControls">7207f030-094e-4e6f-b355-e7655c1fbf97</TermId>
+        </TermInfo>
+      </Terms>
+    </o062e75b76fd4c2ab45f41497e4c179e>
+    <c1cc88710d9c4c84af372a6a51dc9d60 xmlns="a1322699-2fbb-4cce-8aba-176c4fa97253">
+      <Terms xmlns="http://schemas.microsoft.com/office/infopath/2007/PartnerControls"/>
+    </c1cc88710d9c4c84af372a6a51dc9d60>
+    <TaxCatchAll xmlns="a1322699-2fbb-4cce-8aba-176c4fa97253">
+      <Value>7</Value>
+      <Value>17</Value>
+    </TaxCatchAll>
+    <Diffusion xmlns="a1322699-2fbb-4cce-8aba-176c4fa97253">Interne</Diffusion>
+    <Approbateur xmlns="a1322699-2fbb-4cce-8aba-176c4fa97253">
+      <UserInfo>
+        <DisplayName>IGN\tprin</DisplayName>
+        <AccountId>126</AccountId>
+        <AccountType/>
+      </UserInfo>
+    </Approbateur>
+    <_Contributor xmlns="http://schemas.microsoft.com/sharepoint/v3/fields" xsi:nil="true"/>
+    <_Format xmlns="http://schemas.microsoft.com/sharepoint/v3/fields" xsi:nil="true"/>
+    <bb80de6026714cfbab5aa06ad8fd5f59 xmlns="a1322699-2fbb-4cce-8aba-176c4fa97253">
+      <Terms xmlns="http://schemas.microsoft.com/office/infopath/2007/PartnerControls"/>
+    </bb80de6026714cfbab5aa06ad8fd5f59>
+    <_Coverage xmlns="http://schemas.microsoft.com/sharepoint/v3/fields" xsi:nil="true"/>
+    <Date_approbation xmlns="a1322699-2fbb-4cce-8aba-176c4fa97253">2025-01-10T00:00:00</Date_approbation>
+    <_Identifier xmlns="http://schemas.microsoft.com/sharepoint/v3/fields">QUALITÉ-2015-P-776</_Identifier>
+    <_ResourceType xmlns="http://schemas.microsoft.com/sharepoint/v3/fields" xsi:nil="true"/>
+    <_RightsManagement xmlns="http://schemas.microsoft.com/sharepoint/v3/fields" xsi:nil="true"/>
+    <Relecteur xmlns="a1322699-2fbb-4cce-8aba-176c4fa97253">
+      <UserInfo>
+        <DisplayName>IGN\mlouyot</DisplayName>
+        <AccountId>3</AccountId>
+        <AccountType/>
+      </UserInfo>
+      <UserInfo>
+        <DisplayName>IGN\SPaquier</DisplayName>
+        <AccountId>199</AccountId>
+        <AccountType/>
+      </UserInfo>
+    </Relecteur>
+    <Typologie xmlns="a1322699-2fbb-4cce-8aba-176c4fa97253">Modèle Vierge et formulaire</Typologie>
+    <Statut xmlns="a1322699-2fbb-4cce-8aba-176c4fa97253">Finalisé mais non validé</Statut>
+    <Alias_IGN xmlns="a1322699-2fbb-4cce-8aba-176c4fa97253">Résolution des résultats d’appariement des noms de voies et de lieux-dits</Alias_IGN>
+    <Ancienne_référence xmlns="a1322699-2fbb-4cce-8aba-176c4fa97253" xsi:nil="true"/>
+    <Code_typologie xmlns="a1322699-2fbb-4cce-8aba-176c4fa97253" xsi:nil="true"/>
+    <_DCDateCreated xmlns="http://schemas.microsoft.com/sharepoint/v3/fields">2026-01-22T23:00:00Z</_DCDateCreated>
+    <Date_fin_validite xmlns="a1322699-2fbb-4cce-8aba-176c4fa97253" xsi:nil="true"/>
+    <_dlc_DocId xmlns="f0ff482e-aa3b-417e-9d65-5f4cb2656651">UYVM5YNHQ4HK-30-776</_dlc_DocId>
+    <_dlc_DocIdUrl xmlns="f0ff482e-aa3b-417e-9d65-5f4cb2656651">
+      <Url>http://intradoc.ign.fr/ged/DG/QSE/_layouts/DocIdRedir.aspx?ID=UYVM5YNHQ4HK-30-776</Url>
+      <Description>UYVM5YNHQ4HK-30-776</Description>
+    </_dlc_DocIdUrl>
+  </documentManagement>
+</p:properties>
 </file>
 
 <file path=customXml/itemProps1.xml><?xml version="1.0" encoding="utf-8"?>
+<ds:datastoreItem xmlns:ds="http://schemas.openxmlformats.org/officeDocument/2006/customXml" ds:itemID="{EEE2973D-7DD7-4773-855D-5CAD81242BDE}">
+  <ds:schemaRefs>
+    <ds:schemaRef ds:uri="http://schemas.microsoft.com/sharepoint/v3/contenttype/forms"/>
+  </ds:schemaRefs>
+</ds:datastoreItem>
+</file>
+
+<file path=customXml/itemProps2.xml><?xml version="1.0" encoding="utf-8"?>
 <ds:datastoreItem xmlns:ds="http://schemas.openxmlformats.org/officeDocument/2006/customXml" ds:itemID="{68AAD2DA-5792-4B35-80F3-9D0C21EB95BE}">
   <ds:schemaRefs>
     <ds:schemaRef ds:uri="http://schemas.microsoft.com/sharepoint/events"/>
@@ -10938,36 +11592,15 @@
 </ds:datastoreItem>
 </file>
 
-<file path=customXml/itemProps2.xml><?xml version="1.0" encoding="utf-8"?>
-<ds:datastoreItem xmlns:ds="http://schemas.openxmlformats.org/officeDocument/2006/customXml" ds:itemID="{EEE2973D-7DD7-4773-855D-5CAD81242BDE}">
+<file path=customXml/itemProps3.xml><?xml version="1.0" encoding="utf-8"?>
+<ds:datastoreItem xmlns:ds="http://schemas.openxmlformats.org/officeDocument/2006/customXml" ds:itemID="{0FF0F878-5F0F-460C-9013-40E72731A637}">
   <ds:schemaRefs>
-    <ds:schemaRef ds:uri="http://schemas.microsoft.com/sharepoint/v3/contenttype/forms"/>
-  </ds:schemaRefs>
-</ds:datastoreItem>
-</file>
-
-<file path=customXml/itemProps3.xml><?xml version="1.0" encoding="utf-8"?>
-<ds:datastoreItem xmlns:ds="http://schemas.openxmlformats.org/officeDocument/2006/customXml" ds:itemID="{1159403A-C237-488E-8C5E-DABF9FCE7043}">
-  <ds:schemaRefs>
-    <ds:schemaRef ds:uri="http://schemas.microsoft.com/office/2006/metadata/properties"/>
-    <ds:schemaRef ds:uri="http://schemas.microsoft.com/office/infopath/2007/PartnerControls"/>
-    <ds:schemaRef ds:uri="a1322699-2fbb-4cce-8aba-176c4fa97253"/>
-    <ds:schemaRef ds:uri="http://schemas.microsoft.com/sharepoint/v3"/>
-    <ds:schemaRef ds:uri="http://schemas.microsoft.com/sharepoint/v3/fields"/>
-    <ds:schemaRef ds:uri="f0ff482e-aa3b-417e-9d65-5f4cb2656651"/>
+    <ds:schemaRef ds:uri="http://schemas.openxmlformats.org/officeDocument/2006/bibliography"/>
   </ds:schemaRefs>
 </ds:datastoreItem>
 </file>
 
 <file path=customXml/itemProps4.xml><?xml version="1.0" encoding="utf-8"?>
-<ds:datastoreItem xmlns:ds="http://schemas.openxmlformats.org/officeDocument/2006/customXml" ds:itemID="{FBF226EE-3CF7-472C-91DD-A47C59CACF63}">
-  <ds:schemaRefs>
-    <ds:schemaRef ds:uri="Microsoft.SharePoint.Taxonomy.ContentTypeSync"/>
-  </ds:schemaRefs>
-</ds:datastoreItem>
-</file>
-
-<file path=customXml/itemProps5.xml><?xml version="1.0" encoding="utf-8"?>
 <ds:datastoreItem xmlns:ds="http://schemas.openxmlformats.org/officeDocument/2006/customXml" ds:itemID="{8BB746A0-EF99-488C-AF7A-E10AF123421B}">
   <ds:schemaRefs>
     <ds:schemaRef ds:uri="http://schemas.microsoft.com/office/2006/metadata/contentType"/>
@@ -10988,10 +11621,23 @@
 </ds:datastoreItem>
 </file>
 
+<file path=customXml/itemProps5.xml><?xml version="1.0" encoding="utf-8"?>
+<ds:datastoreItem xmlns:ds="http://schemas.openxmlformats.org/officeDocument/2006/customXml" ds:itemID="{FBF226EE-3CF7-472C-91DD-A47C59CACF63}">
+  <ds:schemaRefs>
+    <ds:schemaRef ds:uri="Microsoft.SharePoint.Taxonomy.ContentTypeSync"/>
+  </ds:schemaRefs>
+</ds:datastoreItem>
+</file>
+
 <file path=customXml/itemProps6.xml><?xml version="1.0" encoding="utf-8"?>
-<ds:datastoreItem xmlns:ds="http://schemas.openxmlformats.org/officeDocument/2006/customXml" ds:itemID="{0FF0F878-5F0F-460C-9013-40E72731A637}">
+<ds:datastoreItem xmlns:ds="http://schemas.openxmlformats.org/officeDocument/2006/customXml" ds:itemID="{1159403A-C237-488E-8C5E-DABF9FCE7043}">
   <ds:schemaRefs>
-    <ds:schemaRef ds:uri="http://schemas.openxmlformats.org/officeDocument/2006/bibliography"/>
+    <ds:schemaRef ds:uri="http://schemas.microsoft.com/office/2006/metadata/properties"/>
+    <ds:schemaRef ds:uri="http://schemas.microsoft.com/office/infopath/2007/PartnerControls"/>
+    <ds:schemaRef ds:uri="a1322699-2fbb-4cce-8aba-176c4fa97253"/>
+    <ds:schemaRef ds:uri="http://schemas.microsoft.com/sharepoint/v3"/>
+    <ds:schemaRef ds:uri="http://schemas.microsoft.com/sharepoint/v3/fields"/>
+    <ds:schemaRef ds:uri="f0ff482e-aa3b-417e-9d65-5f4cb2656651"/>
   </ds:schemaRefs>
 </ds:datastoreItem>
 </file>
</xml_diff>